<commit_message>
Added my new resume
</commit_message>
<xml_diff>
--- a/docs/documents/OA_Resume 2026.docx
+++ b/docs/documents/OA_Resume 2026.docx
@@ -1,1235 +1,2314 @@
 
 <file path=word/document.xml><?xml version="1.0" encoding="utf-8"?>
-<w:document xmlns:wpc="http://schemas.microsoft.com/office/word/2010/wordprocessingCanvas" xmlns:cx="http://schemas.microsoft.com/office/drawing/2014/chartex" xmlns:cx1="http://schemas.microsoft.com/office/drawing/2015/9/8/chartex" xmlns:cx2="http://schemas.microsoft.com/office/drawing/2015/10/21/chartex" xmlns:cx3="http://schemas.microsoft.com/office/drawing/2016/5/9/chartex" xmlns:cx4="http://schemas.microsoft.com/office/drawing/2016/5/10/chartex" xmlns:cx5="http://schemas.microsoft.com/office/drawing/2016/5/11/chartex" xmlns:cx6="http://schemas.microsoft.com/office/drawing/2016/5/12/chartex" xmlns:cx7="http://schemas.microsoft.com/office/drawing/2016/5/13/chartex" xmlns:cx8="http://schemas.microsoft.com/office/drawing/2016/5/14/chartex" xmlns:mc="http://schemas.openxmlformats.org/markup-compatibility/2006" xmlns:aink="http://schemas.microsoft.com/office/drawing/2016/ink" xmlns:am3d="http://schemas.microsoft.com/office/drawing/2017/model3d" xmlns:o="urn:schemas-microsoft-com:office:office" xmlns:oel="http://schemas.microsoft.com/office/2019/extlst" xmlns:r="http://schemas.openxmlformats.org/officeDocument/2006/relationships" xmlns:m="http://schemas.openxmlformats.org/officeDocument/2006/math" xmlns:v="urn:schemas-microsoft-com:vml" xmlns:wp14="http://schemas.microsoft.com/office/word/2010/wordprocessingDrawing" xmlns:wp="http://schemas.openxmlformats.org/drawingml/2006/wordprocessingDrawing" xmlns:w10="urn:schemas-microsoft-com:office:word" xmlns:w="http://schemas.openxmlformats.org/wordprocessingml/2006/main" xmlns:w14="http://schemas.microsoft.com/office/word/2010/wordml" xmlns:w15="http://schemas.microsoft.com/office/word/2012/wordml" xmlns:w16cei="http://schemas.microsoft.com/office/word/2026/wordml/cei" xmlns:w16cex="http://schemas.microsoft.com/office/word/2018/wordml/cex" xmlns:w16cid="http://schemas.microsoft.com/office/word/2016/wordml/cid" xmlns:w16="http://schemas.microsoft.com/office/word/2018/wordml" xmlns:w16du="http://schemas.microsoft.com/office/word/2023/wordml/word16du" xmlns:w16sdtdh="http://schemas.microsoft.com/office/word/2020/wordml/sdtdatahash" xmlns:w16sdtfl="http://schemas.microsoft.com/office/word/2024/wordml/sdtformatlock" xmlns:w16se="http://schemas.microsoft.com/office/word/2015/wordml/symex" xmlns:wpg="http://schemas.microsoft.com/office/word/2010/wordprocessingGroup" xmlns:wpi="http://schemas.microsoft.com/office/word/2010/wordprocessingInk" xmlns:wne="http://schemas.microsoft.com/office/word/2006/wordml" xmlns:wps="http://schemas.microsoft.com/office/word/2010/wordprocessingShape" mc:Ignorable="w14 w15 w16se w16cid w16 w16cex w16sdtdh w16sdtfl w16du wp14">
+<w:document xmlns:wpc="http://schemas.microsoft.com/office/word/2010/wordprocessingCanvas" xmlns:cx="http://schemas.microsoft.com/office/drawing/2014/chartex" xmlns:cx1="http://schemas.microsoft.com/office/drawing/2015/9/8/chartex" xmlns:cx2="http://schemas.microsoft.com/office/drawing/2015/10/21/chartex" xmlns:cx3="http://schemas.microsoft.com/office/drawing/2016/5/9/chartex" xmlns:cx4="http://schemas.microsoft.com/office/drawing/2016/5/10/chartex" xmlns:cx5="http://schemas.microsoft.com/office/drawing/2016/5/11/chartex" xmlns:cx6="http://schemas.microsoft.com/office/drawing/2016/5/12/chartex" xmlns:cx7="http://schemas.microsoft.com/office/drawing/2016/5/13/chartex" xmlns:cx8="http://schemas.microsoft.com/office/drawing/2016/5/14/chartex" xmlns:mc="http://schemas.openxmlformats.org/markup-compatibility/2006" xmlns:aink="http://schemas.microsoft.com/office/drawing/2016/ink" xmlns:am3d="http://schemas.microsoft.com/office/drawing/2017/model3d" xmlns:o="urn:schemas-microsoft-com:office:office" xmlns:oel="http://schemas.microsoft.com/office/2019/extlst" xmlns:r="http://schemas.openxmlformats.org/officeDocument/2006/relationships" xmlns:m="http://schemas.openxmlformats.org/officeDocument/2006/math" xmlns:v="urn:schemas-microsoft-com:vml" xmlns:wp14="http://schemas.microsoft.com/office/word/2010/wordprocessingDrawing" xmlns:wp="http://schemas.openxmlformats.org/drawingml/2006/wordprocessingDrawing" xmlns:w10="urn:schemas-microsoft-com:office:word" xmlns:w="http://schemas.openxmlformats.org/wordprocessingml/2006/main" xmlns:w14="http://schemas.microsoft.com/office/word/2010/wordml" xmlns:w15="http://schemas.microsoft.com/office/word/2012/wordml" xmlns:w16cex="http://schemas.microsoft.com/office/word/2018/wordml/cex" xmlns:w16cid="http://schemas.microsoft.com/office/word/2016/wordml/cid" xmlns:w16="http://schemas.microsoft.com/office/word/2018/wordml" xmlns:w16du="http://schemas.microsoft.com/office/word/2023/wordml/word16du" xmlns:w16sdtdh="http://schemas.microsoft.com/office/word/2020/wordml/sdtdatahash" xmlns:w16sdtfl="http://schemas.microsoft.com/office/word/2024/wordml/sdtformatlock" xmlns:w16se="http://schemas.microsoft.com/office/word/2015/wordml/symex" xmlns:wpg="http://schemas.microsoft.com/office/word/2010/wordprocessingGroup" xmlns:wpi="http://schemas.microsoft.com/office/word/2010/wordprocessingInk" xmlns:wne="http://schemas.microsoft.com/office/word/2006/wordml" xmlns:wps="http://schemas.microsoft.com/office/word/2010/wordprocessingShape" mc:Ignorable="w14 w15 w16se w16cid w16 w16cex w16sdtdh w16sdtfl w16du wp14">
   <w:body>
     <w:p>
       <w:pPr>
-        <w:spacing w:after="0"/>
+        <w:spacing w:after="0" w:line="259" w:lineRule="auto"/>
+        <w:ind w:right="6"/>
         <w:jc w:val="center"/>
         <w:rPr>
-          <w:rFonts w:ascii="Times New Roman" w:hAnsi="Times New Roman" w:cs="Times New Roman"/>
+          <w:rFonts w:ascii="Times New Roman" w:eastAsia="Calibri" w:hAnsi="Times New Roman" w:cs="Times New Roman"/>
+          <w:sz w:val="20"/>
+        </w:rPr>
+      </w:pPr>
+      <w:r>
+        <w:rPr>
+          <w:rFonts w:ascii="Times New Roman" w:eastAsia="Calibri" w:hAnsi="Times New Roman" w:cs="Times New Roman"/>
           <w:b/>
-          <w:bCs/>
-          <w:sz w:val="48"/>
-          <w:szCs w:val="48"/>
-        </w:rPr>
-      </w:pPr>
-      <w:r>
-        <w:rPr>
-          <w:rFonts w:ascii="Times New Roman" w:hAnsi="Times New Roman" w:cs="Times New Roman"/>
-          <w:b/>
-          <w:bCs/>
-          <w:sz w:val="48"/>
-          <w:szCs w:val="48"/>
-        </w:rPr>
-        <w:t>Oluwatunmise Aduwo</w:t>
+          <w:sz w:val="42"/>
+        </w:rPr>
+        <w:t>OLUWATUNMISE ADUWO</w:t>
       </w:r>
     </w:p>
     <w:p>
       <w:pPr>
-        <w:spacing w:after="0"/>
+        <w:spacing w:after="0" w:line="259" w:lineRule="auto"/>
         <w:jc w:val="center"/>
         <w:rPr>
-          <w:rFonts w:ascii="Times New Roman" w:hAnsi="Times New Roman" w:cs="Times New Roman"/>
-          <w:sz w:val="28"/>
-          <w:szCs w:val="28"/>
-        </w:rPr>
-      </w:pPr>
-      <w:r>
-        <w:rPr>
-          <w:rFonts w:ascii="Times New Roman" w:hAnsi="Times New Roman" w:cs="Times New Roman"/>
-          <w:sz w:val="28"/>
-          <w:szCs w:val="28"/>
-        </w:rPr>
-        <w:t>Lowell, Massachusetts, 01854</w:t>
-      </w:r>
-      <w:r>
-        <w:rPr>
-          <w:rFonts w:ascii="Times New Roman" w:hAnsi="Times New Roman" w:cs="Times New Roman"/>
-          <w:sz w:val="28"/>
-          <w:szCs w:val="28"/>
-        </w:rPr>
-        <w:t xml:space="preserve"> </w:t>
+          <w:rFonts w:ascii="Times New Roman" w:eastAsia="Calibri" w:hAnsi="Times New Roman" w:cs="Times New Roman"/>
+          <w:sz w:val="20"/>
+        </w:rPr>
+      </w:pPr>
+      <w:r>
+        <w:rPr>
+          <w:rFonts w:ascii="Times New Roman" w:eastAsia="Calibri" w:hAnsi="Times New Roman" w:cs="Times New Roman"/>
+          <w:sz w:val="19"/>
+        </w:rPr>
+        <w:t xml:space="preserve">Lowell, Massachusetts  |  </w:t>
       </w:r>
       <w:hyperlink r:id="rId8" w:history="1">
         <w:r>
           <w:rPr>
-            <w:rStyle w:val="Hyperlink"/>
-            <w:rFonts w:ascii="Times New Roman" w:hAnsi="Times New Roman" w:cs="Times New Roman"/>
-            <w:sz w:val="28"/>
-            <w:szCs w:val="28"/>
+            <w:rFonts w:ascii="Times New Roman" w:eastAsia="Calibri" w:hAnsi="Times New Roman" w:cs="Times New Roman"/>
+            <w:sz w:val="19"/>
+            <w:u w:val="single"/>
           </w:rPr>
-          <w:t>Oluwatunmise_aduwo@student.uml.edu</w:t>
+          <w:t>Oluwatunmise_Aduwo@student.uml.edu</w:t>
         </w:r>
       </w:hyperlink>
       <w:r>
-        <w:t xml:space="preserve"> | Por</w:t>
-      </w:r>
-      <w:r>
-        <w:t>tfolio website</w:t>
+        <w:rPr>
+          <w:rFonts w:ascii="Times New Roman" w:eastAsia="Calibri" w:hAnsi="Times New Roman" w:cs="Times New Roman"/>
+          <w:sz w:val="19"/>
+        </w:rPr>
+        <w:t xml:space="preserve">  |  9785697571 | https://oluwatunmiseaduwo.github.io/resumewebsite/</w:t>
       </w:r>
     </w:p>
     <w:p>
       <w:pPr>
-        <w:spacing w:after="0"/>
-        <w:jc w:val="center"/>
-        <w:rPr>
-          <w:rFonts w:ascii="Times New Roman" w:hAnsi="Times New Roman" w:cs="Times New Roman"/>
-          <w:sz w:val="28"/>
-          <w:szCs w:val="28"/>
-        </w:rPr>
-      </w:pPr>
+        <w:spacing w:after="146" w:line="259" w:lineRule="auto"/>
+        <w:ind w:left="7"/>
+        <w:rPr>
+          <w:rFonts w:ascii="Times New Roman" w:eastAsia="Calibri" w:hAnsi="Times New Roman" w:cs="Times New Roman"/>
+          <w:sz w:val="20"/>
+        </w:rPr>
+      </w:pPr>
+      <w:r>
+        <w:rPr>
+          <w:rFonts w:ascii="Times New Roman" w:eastAsia="Calibri" w:hAnsi="Times New Roman" w:cs="Times New Roman"/>
+          <w:noProof/>
+          <w:sz w:val="22"/>
+        </w:rPr>
+        <mc:AlternateContent>
+          <mc:Choice Requires="wpg">
+            <w:drawing>
+              <wp:inline distT="0" distB="0" distL="0" distR="0" wp14:anchorId="34B756DC" wp14:editId="788C130E">
+                <wp:extent cx="6629399" cy="9525"/>
+                <wp:effectExtent l="0" t="0" r="0" b="0"/>
+                <wp:docPr id="1002" name="Group 1002"/>
+                <wp:cNvGraphicFramePr/>
+                <a:graphic xmlns:a="http://schemas.openxmlformats.org/drawingml/2006/main">
+                  <a:graphicData uri="http://schemas.microsoft.com/office/word/2010/wordprocessingGroup">
+                    <wpg:wgp>
+                      <wpg:cNvGrpSpPr/>
+                      <wpg:grpSpPr>
+                        <a:xfrm>
+                          <a:off x="0" y="0"/>
+                          <a:ext cx="6629399" cy="9525"/>
+                          <a:chOff x="0" y="0"/>
+                          <a:chExt cx="6629399" cy="9525"/>
+                        </a:xfrm>
+                      </wpg:grpSpPr>
+                      <wps:wsp>
+                        <wps:cNvPr id="1361" name="Shape 1361"/>
+                        <wps:cNvSpPr/>
+                        <wps:spPr>
+                          <a:xfrm>
+                            <a:off x="0" y="0"/>
+                            <a:ext cx="6629399" cy="9525"/>
+                          </a:xfrm>
+                          <a:custGeom>
+                            <a:avLst/>
+                            <a:gdLst/>
+                            <a:ahLst/>
+                            <a:cxnLst/>
+                            <a:rect l="0" t="0" r="0" b="0"/>
+                            <a:pathLst>
+                              <a:path w="6629399" h="9525">
+                                <a:moveTo>
+                                  <a:pt x="0" y="0"/>
+                                </a:moveTo>
+                                <a:lnTo>
+                                  <a:pt x="6629399" y="0"/>
+                                </a:lnTo>
+                                <a:lnTo>
+                                  <a:pt x="6629399" y="9525"/>
+                                </a:lnTo>
+                                <a:lnTo>
+                                  <a:pt x="0" y="9525"/>
+                                </a:lnTo>
+                                <a:lnTo>
+                                  <a:pt x="0" y="0"/>
+                                </a:lnTo>
+                              </a:path>
+                            </a:pathLst>
+                          </a:custGeom>
+                          <a:solidFill>
+                            <a:srgbClr val="173B63"/>
+                          </a:solidFill>
+                          <a:ln w="0" cap="flat">
+                            <a:noFill/>
+                            <a:miter lim="127000"/>
+                          </a:ln>
+                          <a:effectLst/>
+                        </wps:spPr>
+                        <wps:bodyPr/>
+                      </wps:wsp>
+                    </wpg:wgp>
+                  </a:graphicData>
+                </a:graphic>
+              </wp:inline>
+            </w:drawing>
+          </mc:Choice>
+          <mc:Fallback>
+            <w:pict>
+              <v:group w14:anchorId="1194D841" id="Group 1002" o:spid="_x0000_s1026" style="width:522pt;height:.75pt;mso-position-horizontal-relative:char;mso-position-vertical-relative:line" coordsize="66293,95" o:gfxdata="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">
+                <v:shape id="Shape 1361" o:spid="_x0000_s1027" style="position:absolute;width:66293;height:95;visibility:visible;mso-wrap-style:square;v-text-anchor:top" coordsize="6629399,9525" o:gfxdata="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" path="m,l6629399,r,9525l,9525,,e" fillcolor="#173b63" stroked="f" strokeweight="0">
+                  <v:stroke miterlimit="83231f" joinstyle="miter"/>
+                  <v:path arrowok="t" textboxrect="0,0,6629399,9525"/>
+                </v:shape>
+                <w10:anchorlock/>
+              </v:group>
+            </w:pict>
+          </mc:Fallback>
+        </mc:AlternateContent>
+      </w:r>
     </w:p>
     <w:p>
       <w:pPr>
-        <w:spacing w:after="0"/>
-        <w:rPr>
-          <w:rFonts w:ascii="Times New Roman" w:hAnsi="Times New Roman" w:cs="Times New Roman"/>
+        <w:keepNext/>
+        <w:keepLines/>
+        <w:spacing w:after="0" w:line="259" w:lineRule="auto"/>
+        <w:ind w:left="-5" w:hanging="10"/>
+        <w:outlineLvl w:val="0"/>
+        <w:rPr>
+          <w:rFonts w:ascii="Times New Roman" w:eastAsia="Calibri" w:hAnsi="Times New Roman" w:cs="Times New Roman"/>
           <w:b/>
-          <w:bCs/>
-          <w:sz w:val="36"/>
-          <w:szCs w:val="36"/>
-        </w:rPr>
-      </w:pPr>
-      <w:r>
-        <w:rPr>
-          <w:rFonts w:ascii="Times New Roman" w:hAnsi="Times New Roman" w:cs="Times New Roman"/>
+          <w:sz w:val="21"/>
+        </w:rPr>
+      </w:pPr>
+      <w:r>
+        <w:rPr>
+          <w:rFonts w:ascii="Times New Roman" w:eastAsia="Calibri" w:hAnsi="Times New Roman" w:cs="Times New Roman"/>
           <w:b/>
-          <w:bCs/>
-          <w:sz w:val="36"/>
-          <w:szCs w:val="36"/>
-        </w:rPr>
-        <w:t>Summary</w:t>
+          <w:sz w:val="21"/>
+        </w:rPr>
+        <w:t>PROFESSIONAL SUMMARY</w:t>
       </w:r>
     </w:p>
     <w:p>
       <w:pPr>
-        <w:spacing w:after="0"/>
-        <w:rPr>
-          <w:rFonts w:ascii="Times New Roman" w:hAnsi="Times New Roman" w:cs="Times New Roman"/>
-        </w:rPr>
-      </w:pPr>
-      <w:r>
-        <w:rPr>
-          <w:rFonts w:ascii="Times New Roman" w:hAnsi="Times New Roman" w:cs="Times New Roman"/>
-        </w:rPr>
-        <w:t>Computer science senior concentrati</w:t>
-      </w:r>
-      <w:r>
-        <w:rPr>
-          <w:rFonts w:ascii="Times New Roman" w:hAnsi="Times New Roman" w:cs="Times New Roman"/>
-        </w:rPr>
-        <w:t>on</w:t>
-      </w:r>
-      <w:r>
-        <w:rPr>
-          <w:rFonts w:ascii="Times New Roman" w:hAnsi="Times New Roman" w:cs="Times New Roman"/>
-        </w:rPr>
-        <w:t xml:space="preserve"> in cybersecurity</w:t>
-      </w:r>
-      <w:r>
-        <w:rPr>
-          <w:rFonts w:ascii="Times New Roman" w:hAnsi="Times New Roman" w:cs="Times New Roman"/>
-        </w:rPr>
-        <w:t xml:space="preserve"> and a minor in mathematics</w:t>
-      </w:r>
-      <w:r>
-        <w:rPr>
-          <w:rFonts w:ascii="Times New Roman" w:hAnsi="Times New Roman" w:cs="Times New Roman"/>
-        </w:rPr>
-        <w:t xml:space="preserve">, </w:t>
-      </w:r>
-      <w:r>
-        <w:rPr>
-          <w:rFonts w:ascii="Times New Roman" w:hAnsi="Times New Roman" w:cs="Times New Roman"/>
-        </w:rPr>
-        <w:t>P</w:t>
-      </w:r>
-      <w:r>
-        <w:rPr>
-          <w:rFonts w:ascii="Times New Roman" w:hAnsi="Times New Roman" w:cs="Times New Roman"/>
-        </w:rPr>
-        <w:t>assionate about defensive security, threat detection, and automation.</w:t>
-      </w:r>
-      <w:r>
-        <w:rPr>
-          <w:rFonts w:ascii="Times New Roman" w:hAnsi="Times New Roman" w:cs="Times New Roman"/>
-        </w:rPr>
-        <w:t xml:space="preserve"> </w:t>
-      </w:r>
-      <w:r>
-        <w:rPr>
-          <w:rFonts w:ascii="Times New Roman" w:hAnsi="Times New Roman" w:cs="Times New Roman"/>
-        </w:rPr>
-        <w:t>S</w:t>
-      </w:r>
-      <w:r>
-        <w:rPr>
-          <w:rFonts w:ascii="Times New Roman" w:hAnsi="Times New Roman" w:cs="Times New Roman"/>
-        </w:rPr>
-        <w:t xml:space="preserve">eeking a cybersecurity or security analyst internship or job when I can continue to develop my skills </w:t>
-      </w:r>
-      <w:r>
-        <w:rPr>
-          <w:rFonts w:ascii="Times New Roman" w:hAnsi="Times New Roman" w:cs="Times New Roman"/>
-        </w:rPr>
-        <w:t>and gain real-world experience.</w:t>
+        <w:spacing w:after="114" w:line="256" w:lineRule="auto"/>
+        <w:ind w:left="10" w:hanging="10"/>
+        <w:rPr>
+          <w:rFonts w:ascii="Times New Roman" w:eastAsia="Calibri" w:hAnsi="Times New Roman" w:cs="Times New Roman"/>
+          <w:sz w:val="20"/>
+        </w:rPr>
+      </w:pPr>
+      <w:r>
+        <w:rPr>
+          <w:rFonts w:ascii="Times New Roman" w:eastAsia="Calibri" w:hAnsi="Times New Roman" w:cs="Times New Roman"/>
+          <w:sz w:val="20"/>
+        </w:rPr>
+        <w:t>Cybersecurity-focused Computer Science senior at the University of Massachusetts Lowell, graduating December 2026 with a minor in Mathematics. Hands-on experience researching enterprise security risks, analyzing network traffic, building secure software, documenting incidents, and translating technical information for varied audiences. Seeking an entry-level cybersecurity, security operations, or network security role.</w:t>
       </w:r>
     </w:p>
     <w:p>
       <w:pPr>
-        <w:spacing w:after="0"/>
-        <w:rPr>
-          <w:rFonts w:ascii="Times New Roman" w:hAnsi="Times New Roman" w:cs="Times New Roman"/>
+        <w:keepNext/>
+        <w:keepLines/>
+        <w:spacing w:after="0" w:line="259" w:lineRule="auto"/>
+        <w:ind w:left="-5" w:hanging="10"/>
+        <w:outlineLvl w:val="0"/>
+        <w:rPr>
+          <w:rFonts w:ascii="Times New Roman" w:eastAsia="Calibri" w:hAnsi="Times New Roman" w:cs="Times New Roman"/>
           <w:b/>
-          <w:bCs/>
-          <w:sz w:val="36"/>
-          <w:szCs w:val="36"/>
-        </w:rPr>
-      </w:pPr>
-      <w:r>
-        <w:rPr>
-          <w:rFonts w:ascii="Times New Roman" w:hAnsi="Times New Roman" w:cs="Times New Roman"/>
+          <w:sz w:val="21"/>
+        </w:rPr>
+      </w:pPr>
+      <w:r>
+        <w:rPr>
+          <w:rFonts w:ascii="Times New Roman" w:eastAsia="Calibri" w:hAnsi="Times New Roman" w:cs="Times New Roman"/>
           <w:b/>
-          <w:bCs/>
-          <w:sz w:val="36"/>
-          <w:szCs w:val="36"/>
-        </w:rPr>
-        <w:t>Education</w:t>
+          <w:sz w:val="21"/>
+        </w:rPr>
+        <w:t>TECHNICAL SKILLS</w:t>
       </w:r>
     </w:p>
     <w:p>
       <w:pPr>
-        <w:spacing w:after="0"/>
-        <w:rPr>
-          <w:rFonts w:ascii="Times New Roman" w:hAnsi="Times New Roman" w:cs="Times New Roman"/>
-        </w:rPr>
-      </w:pPr>
-      <w:r>
-        <w:rPr>
-          <w:rFonts w:ascii="Times New Roman" w:hAnsi="Times New Roman" w:cs="Times New Roman"/>
-        </w:rPr>
-        <w:t>Un</w:t>
-      </w:r>
-      <w:r>
-        <w:rPr>
-          <w:rFonts w:ascii="Times New Roman" w:hAnsi="Times New Roman" w:cs="Times New Roman"/>
-        </w:rPr>
-        <w:t>iversity of Massachusetts Lowell, Lowell, Massachusetts</w:t>
-      </w:r>
-      <w:r>
-        <w:rPr>
-          <w:rFonts w:ascii="Times New Roman" w:hAnsi="Times New Roman" w:cs="Times New Roman"/>
-        </w:rPr>
-        <w:t xml:space="preserve"> </w:t>
-      </w:r>
-      <w:r>
-        <w:rPr>
-          <w:rFonts w:ascii="Times New Roman" w:hAnsi="Times New Roman" w:cs="Times New Roman"/>
-        </w:rPr>
-        <w:tab/>
-      </w:r>
-      <w:r>
-        <w:rPr>
-          <w:rFonts w:ascii="Times New Roman" w:hAnsi="Times New Roman" w:cs="Times New Roman"/>
-        </w:rPr>
-        <w:tab/>
-      </w:r>
-      <w:r>
-        <w:rPr>
-          <w:rFonts w:ascii="Times New Roman" w:hAnsi="Times New Roman" w:cs="Times New Roman"/>
-        </w:rPr>
-        <w:t xml:space="preserve">   </w:t>
-      </w:r>
-      <w:r>
-        <w:rPr>
-          <w:rFonts w:ascii="Times New Roman" w:hAnsi="Times New Roman" w:cs="Times New Roman"/>
-        </w:rPr>
-        <w:t>September 2022 – December 2026</w:t>
+        <w:spacing w:after="24" w:line="251" w:lineRule="auto"/>
+        <w:ind w:left="-5" w:hanging="10"/>
+        <w:rPr>
+          <w:rFonts w:ascii="Times New Roman" w:eastAsia="Calibri" w:hAnsi="Times New Roman" w:cs="Times New Roman"/>
+          <w:sz w:val="20"/>
+        </w:rPr>
+      </w:pPr>
+      <w:r>
+        <w:rPr>
+          <w:rFonts w:ascii="Times New Roman" w:eastAsia="Calibri" w:hAnsi="Times New Roman" w:cs="Times New Roman"/>
+          <w:b/>
+          <w:sz w:val="19"/>
+        </w:rPr>
+        <w:t>Security:</w:t>
+      </w:r>
+      <w:r>
+        <w:rPr>
+          <w:rFonts w:ascii="Times New Roman" w:eastAsia="Calibri" w:hAnsi="Times New Roman" w:cs="Times New Roman"/>
+          <w:sz w:val="19"/>
+        </w:rPr>
+        <w:t xml:space="preserve"> Wireshark, network traffic analysis, NIST Cybersecurity Framework, malware analysis, ransomware defense research , access control, data privacy.</w:t>
       </w:r>
     </w:p>
     <w:p>
       <w:pPr>
-        <w:spacing w:after="0"/>
-        <w:rPr>
-          <w:rFonts w:ascii="Times New Roman" w:hAnsi="Times New Roman" w:cs="Times New Roman"/>
-        </w:rPr>
-      </w:pPr>
-      <w:r>
-        <w:rPr>
-          <w:rFonts w:ascii="Times New Roman" w:hAnsi="Times New Roman" w:cs="Times New Roman"/>
-        </w:rPr>
-        <w:t>Bachelor of Science</w:t>
-      </w:r>
-      <w:r>
-        <w:rPr>
-          <w:rFonts w:ascii="Times New Roman" w:hAnsi="Times New Roman" w:cs="Times New Roman"/>
-        </w:rPr>
-        <w:t xml:space="preserve"> in </w:t>
-      </w:r>
-      <w:r>
-        <w:rPr>
-          <w:rFonts w:ascii="Times New Roman" w:hAnsi="Times New Roman" w:cs="Times New Roman"/>
-        </w:rPr>
-        <w:t>Computer Science</w:t>
-      </w:r>
-      <w:r>
-        <w:rPr>
-          <w:rFonts w:ascii="Times New Roman" w:hAnsi="Times New Roman" w:cs="Times New Roman"/>
-        </w:rPr>
-        <w:t>, Concentration</w:t>
-      </w:r>
-      <w:r>
-        <w:rPr>
-          <w:rFonts w:ascii="Times New Roman" w:hAnsi="Times New Roman" w:cs="Times New Roman"/>
-        </w:rPr>
-        <w:t xml:space="preserve">: </w:t>
-      </w:r>
-      <w:r>
-        <w:rPr>
-          <w:rFonts w:ascii="Times New Roman" w:hAnsi="Times New Roman" w:cs="Times New Roman"/>
-        </w:rPr>
-        <w:t xml:space="preserve">Cybersecurity </w:t>
-      </w:r>
-      <w:r>
-        <w:rPr>
-          <w:rFonts w:ascii="Times New Roman" w:hAnsi="Times New Roman" w:cs="Times New Roman"/>
-        </w:rPr>
-        <w:t xml:space="preserve">| </w:t>
-      </w:r>
-      <w:r>
-        <w:rPr>
-          <w:rFonts w:ascii="Times New Roman" w:hAnsi="Times New Roman" w:cs="Times New Roman"/>
-        </w:rPr>
-        <w:t>Minor: Mathematics</w:t>
+        <w:spacing w:after="24" w:line="251" w:lineRule="auto"/>
+        <w:ind w:left="-5" w:hanging="10"/>
+        <w:rPr>
+          <w:rFonts w:ascii="Times New Roman" w:eastAsia="Calibri" w:hAnsi="Times New Roman" w:cs="Times New Roman"/>
+          <w:sz w:val="20"/>
+        </w:rPr>
+      </w:pPr>
+      <w:r>
+        <w:rPr>
+          <w:rFonts w:ascii="Times New Roman" w:eastAsia="Calibri" w:hAnsi="Times New Roman" w:cs="Times New Roman"/>
+          <w:b/>
+          <w:sz w:val="19"/>
+        </w:rPr>
+        <w:t>Programming:</w:t>
+      </w:r>
+      <w:r>
+        <w:rPr>
+          <w:rFonts w:ascii="Times New Roman" w:eastAsia="Calibri" w:hAnsi="Times New Roman" w:cs="Times New Roman"/>
+          <w:sz w:val="19"/>
+        </w:rPr>
+        <w:t xml:space="preserve"> Python, SQL, C/C++, JavaScript, HTML, CSS</w:t>
       </w:r>
     </w:p>
     <w:p>
       <w:pPr>
-        <w:spacing w:after="0"/>
-        <w:rPr>
-          <w:rFonts w:ascii="Times New Roman" w:hAnsi="Times New Roman" w:cs="Times New Roman"/>
+        <w:spacing w:after="141" w:line="251" w:lineRule="auto"/>
+        <w:ind w:left="-5" w:hanging="10"/>
+        <w:rPr>
+          <w:rFonts w:ascii="Times New Roman" w:eastAsia="Calibri" w:hAnsi="Times New Roman" w:cs="Times New Roman"/>
+          <w:sz w:val="20"/>
+        </w:rPr>
+      </w:pPr>
+      <w:r>
+        <w:rPr>
+          <w:rFonts w:ascii="Times New Roman" w:eastAsia="Calibri" w:hAnsi="Times New Roman" w:cs="Times New Roman"/>
           <w:b/>
-          <w:bCs/>
-          <w:sz w:val="36"/>
-          <w:szCs w:val="36"/>
-        </w:rPr>
-      </w:pPr>
-      <w:r>
-        <w:rPr>
-          <w:rFonts w:ascii="Times New Roman" w:hAnsi="Times New Roman" w:cs="Times New Roman"/>
-        </w:rPr>
-        <w:t>Relevant Coursework: Computing I,II&amp;III</w:t>
-      </w:r>
-      <w:r>
-        <w:rPr>
-          <w:rFonts w:ascii="Times New Roman" w:hAnsi="Times New Roman" w:cs="Times New Roman"/>
-        </w:rPr>
-        <w:t xml:space="preserve">, </w:t>
-      </w:r>
-      <w:r>
-        <w:rPr>
-          <w:rFonts w:ascii="Times New Roman" w:hAnsi="Times New Roman" w:cs="Times New Roman"/>
-        </w:rPr>
-        <w:t xml:space="preserve">Introduction to </w:t>
-      </w:r>
-      <w:r>
-        <w:rPr>
-          <w:rFonts w:ascii="Times New Roman" w:hAnsi="Times New Roman" w:cs="Times New Roman"/>
-        </w:rPr>
-        <w:t>C</w:t>
-      </w:r>
-      <w:r>
-        <w:rPr>
-          <w:rFonts w:ascii="Times New Roman" w:hAnsi="Times New Roman" w:cs="Times New Roman"/>
-        </w:rPr>
-        <w:t xml:space="preserve">omputer </w:t>
-      </w:r>
-      <w:r>
-        <w:rPr>
-          <w:rFonts w:ascii="Times New Roman" w:hAnsi="Times New Roman" w:cs="Times New Roman"/>
-        </w:rPr>
-        <w:t>S</w:t>
-      </w:r>
-      <w:r>
-        <w:rPr>
-          <w:rFonts w:ascii="Times New Roman" w:hAnsi="Times New Roman" w:cs="Times New Roman"/>
-        </w:rPr>
-        <w:t xml:space="preserve">ecurity, </w:t>
-      </w:r>
-      <w:r>
-        <w:rPr>
-          <w:rFonts w:ascii="Times New Roman" w:hAnsi="Times New Roman" w:cs="Times New Roman"/>
-        </w:rPr>
-        <w:t>D</w:t>
-      </w:r>
-      <w:r>
-        <w:rPr>
-          <w:rFonts w:ascii="Times New Roman" w:hAnsi="Times New Roman" w:cs="Times New Roman"/>
-        </w:rPr>
-        <w:t xml:space="preserve">ata </w:t>
-      </w:r>
-      <w:r>
-        <w:rPr>
-          <w:rFonts w:ascii="Times New Roman" w:hAnsi="Times New Roman" w:cs="Times New Roman"/>
-        </w:rPr>
-        <w:t>C</w:t>
-      </w:r>
-      <w:r>
-        <w:rPr>
-          <w:rFonts w:ascii="Times New Roman" w:hAnsi="Times New Roman" w:cs="Times New Roman"/>
-        </w:rPr>
-        <w:t>ommunication I</w:t>
-      </w:r>
-      <w:r>
-        <w:rPr>
-          <w:rFonts w:ascii="Times New Roman" w:hAnsi="Times New Roman" w:cs="Times New Roman"/>
-        </w:rPr>
-        <w:t xml:space="preserve">, </w:t>
-      </w:r>
-      <w:r>
-        <w:rPr>
-          <w:rFonts w:ascii="Times New Roman" w:hAnsi="Times New Roman" w:cs="Times New Roman"/>
-        </w:rPr>
-        <w:t xml:space="preserve">Database I, </w:t>
-      </w:r>
-      <w:r>
-        <w:rPr>
-          <w:rFonts w:ascii="Times New Roman" w:hAnsi="Times New Roman" w:cs="Times New Roman"/>
-        </w:rPr>
-        <w:t xml:space="preserve">Introduction to Malware analysis, Protecting against </w:t>
-      </w:r>
-      <w:r>
-        <w:rPr>
-          <w:rFonts w:ascii="Times New Roman" w:hAnsi="Times New Roman" w:cs="Times New Roman"/>
-        </w:rPr>
-        <w:t>R</w:t>
-      </w:r>
-      <w:r>
-        <w:rPr>
-          <w:rFonts w:ascii="Times New Roman" w:hAnsi="Times New Roman" w:cs="Times New Roman"/>
-        </w:rPr>
-        <w:t xml:space="preserve">ansomware </w:t>
-      </w:r>
-      <w:r>
-        <w:rPr>
-          <w:rFonts w:ascii="Times New Roman" w:hAnsi="Times New Roman" w:cs="Times New Roman"/>
-        </w:rPr>
-        <w:t>A</w:t>
-      </w:r>
-      <w:r>
-        <w:rPr>
-          <w:rFonts w:ascii="Times New Roman" w:hAnsi="Times New Roman" w:cs="Times New Roman"/>
-        </w:rPr>
-        <w:t>ttacks</w:t>
-      </w:r>
-      <w:r>
-        <w:rPr>
-          <w:rFonts w:ascii="Times New Roman" w:hAnsi="Times New Roman" w:cs="Times New Roman"/>
-        </w:rPr>
-        <w:t>; Research topics</w:t>
-      </w:r>
-      <w:r>
-        <w:rPr>
-          <w:rFonts w:ascii="Times New Roman" w:hAnsi="Times New Roman" w:cs="Times New Roman"/>
-        </w:rPr>
-        <w:t xml:space="preserve"> on NIST Cybersecurity </w:t>
-      </w:r>
-      <w:proofErr w:type="spellStart"/>
-      <w:r>
-        <w:rPr>
-          <w:rFonts w:ascii="Times New Roman" w:hAnsi="Times New Roman" w:cs="Times New Roman"/>
-        </w:rPr>
-        <w:t>Framwork</w:t>
-      </w:r>
-      <w:proofErr w:type="spellEnd"/>
-      <w:r>
-        <w:rPr>
-          <w:rFonts w:ascii="Times New Roman" w:hAnsi="Times New Roman" w:cs="Times New Roman"/>
-        </w:rPr>
-        <w:t>.</w:t>
-      </w:r>
-      <w:r>
-        <w:rPr>
-          <w:rFonts w:ascii="Times New Roman" w:hAnsi="Times New Roman" w:cs="Times New Roman"/>
-          <w:b/>
-          <w:bCs/>
-          <w:sz w:val="36"/>
-          <w:szCs w:val="36"/>
-        </w:rPr>
-        <w:t xml:space="preserve"> </w:t>
+          <w:sz w:val="19"/>
+        </w:rPr>
+        <w:t>Tools:</w:t>
+      </w:r>
+      <w:r>
+        <w:rPr>
+          <w:rFonts w:ascii="Times New Roman" w:eastAsia="Calibri" w:hAnsi="Times New Roman" w:cs="Times New Roman"/>
+          <w:sz w:val="19"/>
+        </w:rPr>
+        <w:t xml:space="preserve"> Linux, GitHub, Visual Studio Code, Microsoft applications</w:t>
       </w:r>
     </w:p>
     <w:p>
       <w:pPr>
-        <w:spacing w:after="0"/>
-        <w:rPr>
-          <w:rFonts w:ascii="Times New Roman" w:hAnsi="Times New Roman" w:cs="Times New Roman"/>
-        </w:rPr>
-      </w:pPr>
-      <w:r>
-        <w:rPr>
-          <w:rFonts w:ascii="Times New Roman" w:hAnsi="Times New Roman" w:cs="Times New Roman"/>
+        <w:keepNext/>
+        <w:keepLines/>
+        <w:spacing w:after="0" w:line="259" w:lineRule="auto"/>
+        <w:ind w:left="-5" w:hanging="10"/>
+        <w:outlineLvl w:val="0"/>
+        <w:rPr>
+          <w:rFonts w:ascii="Times New Roman" w:eastAsia="Calibri" w:hAnsi="Times New Roman" w:cs="Times New Roman"/>
           <w:b/>
-          <w:bCs/>
-          <w:sz w:val="36"/>
-          <w:szCs w:val="36"/>
-        </w:rPr>
-        <w:t>Skills</w:t>
+          <w:sz w:val="21"/>
+        </w:rPr>
+      </w:pPr>
+      <w:r>
+        <w:rPr>
+          <w:rFonts w:ascii="Times New Roman" w:eastAsia="Calibri" w:hAnsi="Times New Roman" w:cs="Times New Roman"/>
+          <w:b/>
+          <w:sz w:val="21"/>
+        </w:rPr>
+        <w:t>EDUCATION</w:t>
       </w:r>
     </w:p>
     <w:p>
       <w:pPr>
-        <w:spacing w:after="0"/>
-        <w:rPr>
-          <w:rFonts w:ascii="Times New Roman" w:hAnsi="Times New Roman" w:cs="Times New Roman"/>
-        </w:rPr>
-      </w:pPr>
-      <w:r>
-        <w:rPr>
-          <w:rFonts w:ascii="Times New Roman" w:hAnsi="Times New Roman" w:cs="Times New Roman"/>
-        </w:rPr>
-        <w:t>Computer: C/C++</w:t>
-      </w:r>
-      <w:r>
-        <w:rPr>
-          <w:rFonts w:ascii="Times New Roman" w:hAnsi="Times New Roman" w:cs="Times New Roman"/>
-        </w:rPr>
-        <w:t>, Python</w:t>
-      </w:r>
-      <w:r>
-        <w:rPr>
-          <w:rFonts w:ascii="Times New Roman" w:hAnsi="Times New Roman" w:cs="Times New Roman"/>
-        </w:rPr>
-        <w:t>, Java</w:t>
-      </w:r>
-      <w:r>
-        <w:rPr>
-          <w:rFonts w:ascii="Times New Roman" w:hAnsi="Times New Roman" w:cs="Times New Roman"/>
-        </w:rPr>
-        <w:t>Script</w:t>
-      </w:r>
-      <w:r>
-        <w:rPr>
-          <w:rFonts w:ascii="Times New Roman" w:hAnsi="Times New Roman" w:cs="Times New Roman"/>
-        </w:rPr>
-        <w:t xml:space="preserve">, </w:t>
-      </w:r>
-      <w:r>
-        <w:rPr>
-          <w:rFonts w:ascii="Times New Roman" w:hAnsi="Times New Roman" w:cs="Times New Roman"/>
-        </w:rPr>
-        <w:t>CSS</w:t>
-      </w:r>
-      <w:r>
-        <w:rPr>
-          <w:rFonts w:ascii="Times New Roman" w:hAnsi="Times New Roman" w:cs="Times New Roman"/>
-        </w:rPr>
-        <w:t>,</w:t>
-      </w:r>
-      <w:r>
-        <w:rPr>
-          <w:rFonts w:ascii="Times New Roman" w:hAnsi="Times New Roman" w:cs="Times New Roman"/>
-        </w:rPr>
-        <w:t xml:space="preserve"> SQL,</w:t>
-      </w:r>
-      <w:r>
-        <w:rPr>
-          <w:rFonts w:ascii="Times New Roman" w:hAnsi="Times New Roman" w:cs="Times New Roman"/>
-        </w:rPr>
-        <w:t xml:space="preserve"> HTML, </w:t>
-      </w:r>
-      <w:r>
-        <w:rPr>
-          <w:rFonts w:ascii="Times New Roman" w:hAnsi="Times New Roman" w:cs="Times New Roman"/>
-        </w:rPr>
-        <w:t>Kali Linux, MITRE ATT&amp;CK</w:t>
-      </w:r>
-      <w:r>
-        <w:rPr>
-          <w:rFonts w:ascii="Times New Roman" w:hAnsi="Times New Roman" w:cs="Times New Roman"/>
-        </w:rPr>
-        <w:t>, GitHub, Visual Studio Code, Linux,</w:t>
-      </w:r>
-      <w:r>
-        <w:rPr>
-          <w:rFonts w:ascii="Times New Roman" w:hAnsi="Times New Roman" w:cs="Times New Roman"/>
-        </w:rPr>
-        <w:t xml:space="preserve"> </w:t>
-      </w:r>
-      <w:r>
-        <w:rPr>
-          <w:rFonts w:ascii="Times New Roman" w:hAnsi="Times New Roman" w:cs="Times New Roman"/>
-        </w:rPr>
-        <w:t>Wazuh</w:t>
-      </w:r>
-      <w:r>
-        <w:rPr>
-          <w:rFonts w:ascii="Times New Roman" w:hAnsi="Times New Roman" w:cs="Times New Roman"/>
-        </w:rPr>
-        <w:t>, Nessus Essentials</w:t>
-      </w:r>
-      <w:r>
-        <w:rPr>
-          <w:rFonts w:ascii="Times New Roman" w:hAnsi="Times New Roman" w:cs="Times New Roman"/>
-        </w:rPr>
-        <w:t>.</w:t>
+        <w:tabs>
+          <w:tab w:val="right" w:pos="10455"/>
+        </w:tabs>
+        <w:spacing w:after="0" w:line="259" w:lineRule="auto"/>
+        <w:ind w:left="-15" w:right="-15"/>
+        <w:rPr>
+          <w:rFonts w:ascii="Times New Roman" w:eastAsia="Calibri" w:hAnsi="Times New Roman" w:cs="Times New Roman"/>
+          <w:sz w:val="20"/>
+        </w:rPr>
+      </w:pPr>
+      <w:r>
+        <w:rPr>
+          <w:rFonts w:ascii="Times New Roman" w:eastAsia="Calibri" w:hAnsi="Times New Roman" w:cs="Times New Roman"/>
+          <w:b/>
+          <w:sz w:val="20"/>
+        </w:rPr>
+        <w:t>University of Massachusetts Lowell</w:t>
+      </w:r>
+      <w:r>
+        <w:rPr>
+          <w:rFonts w:ascii="Times New Roman" w:eastAsia="Calibri" w:hAnsi="Times New Roman" w:cs="Times New Roman"/>
+          <w:b/>
+          <w:sz w:val="20"/>
+        </w:rPr>
+        <w:tab/>
+      </w:r>
+      <w:r>
+        <w:rPr>
+          <w:rFonts w:ascii="Times New Roman" w:eastAsia="Calibri" w:hAnsi="Times New Roman" w:cs="Times New Roman"/>
+          <w:sz w:val="19"/>
+        </w:rPr>
+        <w:t>Sep 2022 - Dec 2026</w:t>
       </w:r>
     </w:p>
     <w:p>
       <w:pPr>
-        <w:spacing w:after="0"/>
-        <w:rPr>
-          <w:rFonts w:ascii="Times New Roman" w:hAnsi="Times New Roman" w:cs="Times New Roman"/>
-        </w:rPr>
-      </w:pPr>
-      <w:r>
-        <w:rPr>
-          <w:rFonts w:ascii="Times New Roman" w:hAnsi="Times New Roman" w:cs="Times New Roman"/>
-          <w:b/>
-          <w:bCs/>
-          <w:sz w:val="36"/>
-          <w:szCs w:val="36"/>
-        </w:rPr>
-        <w:t>Projects</w:t>
-      </w:r>
-      <w:r>
-        <w:rPr>
-          <w:rFonts w:ascii="Times New Roman" w:hAnsi="Times New Roman" w:cs="Times New Roman"/>
-        </w:rPr>
-        <w:t xml:space="preserve"> </w:t>
+        <w:spacing w:after="52" w:line="259" w:lineRule="auto"/>
+        <w:ind w:left="-5" w:hanging="10"/>
+        <w:rPr>
+          <w:rFonts w:ascii="Times New Roman" w:eastAsia="Calibri" w:hAnsi="Times New Roman" w:cs="Times New Roman"/>
+          <w:sz w:val="20"/>
+        </w:rPr>
+      </w:pPr>
+      <w:r>
+        <w:rPr>
+          <w:rFonts w:ascii="Times New Roman" w:eastAsia="Calibri" w:hAnsi="Times New Roman" w:cs="Times New Roman"/>
+          <w:i/>
+          <w:sz w:val="19"/>
+        </w:rPr>
+        <w:t>Bachelor of Science in Computer Science | Cybersecurity Concentration | Mathematics Minor</w:t>
       </w:r>
     </w:p>
     <w:p>
       <w:pPr>
-        <w:spacing w:after="0"/>
-        <w:rPr>
-          <w:rFonts w:ascii="Times New Roman" w:hAnsi="Times New Roman" w:cs="Times New Roman"/>
-        </w:rPr>
-      </w:pPr>
-      <w:r>
-        <w:rPr>
-          <w:rFonts w:ascii="Times New Roman" w:hAnsi="Times New Roman" w:cs="Times New Roman"/>
-        </w:rPr>
-        <w:t xml:space="preserve">MassCyberCenter Mentorship Program </w:t>
-      </w:r>
-      <w:r>
-        <w:rPr>
-          <w:rFonts w:ascii="Times New Roman" w:hAnsi="Times New Roman" w:cs="Times New Roman"/>
+        <w:spacing w:after="115" w:line="256" w:lineRule="auto"/>
+        <w:ind w:left="270" w:hanging="233"/>
+        <w:rPr>
+          <w:rFonts w:ascii="Times New Roman" w:eastAsia="Calibri" w:hAnsi="Times New Roman" w:cs="Times New Roman"/>
+          <w:sz w:val="20"/>
+        </w:rPr>
+      </w:pPr>
+      <w:r>
+        <w:rPr>
+          <w:rFonts w:ascii="Times New Roman" w:eastAsia="Calibri" w:hAnsi="Times New Roman" w:cs="Times New Roman"/>
+          <w:noProof/>
+          <w:sz w:val="22"/>
+        </w:rPr>
+        <mc:AlternateContent>
+          <mc:Choice Requires="wpg">
+            <w:drawing>
+              <wp:inline distT="0" distB="0" distL="0" distR="0" wp14:anchorId="30C3F7D3" wp14:editId="69071751">
+                <wp:extent cx="38100" cy="38100"/>
+                <wp:effectExtent l="0" t="0" r="0" b="0"/>
+                <wp:docPr id="1008" name="Group 1008"/>
+                <wp:cNvGraphicFramePr/>
+                <a:graphic xmlns:a="http://schemas.openxmlformats.org/drawingml/2006/main">
+                  <a:graphicData uri="http://schemas.microsoft.com/office/word/2010/wordprocessingGroup">
+                    <wpg:wgp>
+                      <wpg:cNvGrpSpPr/>
+                      <wpg:grpSpPr>
+                        <a:xfrm>
+                          <a:off x="0" y="0"/>
+                          <a:ext cx="38100" cy="38100"/>
+                          <a:chOff x="0" y="0"/>
+                          <a:chExt cx="38100" cy="38100"/>
+                        </a:xfrm>
+                      </wpg:grpSpPr>
+                      <wps:wsp>
+                        <wps:cNvPr id="33" name="Shape 33"/>
+                        <wps:cNvSpPr/>
+                        <wps:spPr>
+                          <a:xfrm>
+                            <a:off x="0" y="0"/>
+                            <a:ext cx="38100" cy="38100"/>
+                          </a:xfrm>
+                          <a:custGeom>
+                            <a:avLst/>
+                            <a:gdLst/>
+                            <a:ahLst/>
+                            <a:cxnLst/>
+                            <a:rect l="0" t="0" r="0" b="0"/>
+                            <a:pathLst>
+                              <a:path w="38100" h="38100">
+                                <a:moveTo>
+                                  <a:pt x="19050" y="0"/>
+                                </a:moveTo>
+                                <a:cubicBezTo>
+                                  <a:pt x="21576" y="0"/>
+                                  <a:pt x="24006" y="483"/>
+                                  <a:pt x="26340" y="1450"/>
+                                </a:cubicBezTo>
+                                <a:cubicBezTo>
+                                  <a:pt x="28674" y="2417"/>
+                                  <a:pt x="30734" y="3793"/>
+                                  <a:pt x="32520" y="5580"/>
+                                </a:cubicBezTo>
+                                <a:cubicBezTo>
+                                  <a:pt x="34307" y="7366"/>
+                                  <a:pt x="35683" y="9426"/>
+                                  <a:pt x="36650" y="11760"/>
+                                </a:cubicBezTo>
+                                <a:cubicBezTo>
+                                  <a:pt x="37617" y="14093"/>
+                                  <a:pt x="38100" y="16524"/>
+                                  <a:pt x="38100" y="19050"/>
+                                </a:cubicBezTo>
+                                <a:cubicBezTo>
+                                  <a:pt x="38100" y="21576"/>
+                                  <a:pt x="37617" y="24006"/>
+                                  <a:pt x="36650" y="26339"/>
+                                </a:cubicBezTo>
+                                <a:cubicBezTo>
+                                  <a:pt x="35683" y="28673"/>
+                                  <a:pt x="34307" y="30733"/>
+                                  <a:pt x="32520" y="32520"/>
+                                </a:cubicBezTo>
+                                <a:cubicBezTo>
+                                  <a:pt x="30734" y="34306"/>
+                                  <a:pt x="28674" y="35682"/>
+                                  <a:pt x="26340" y="36649"/>
+                                </a:cubicBezTo>
+                                <a:cubicBezTo>
+                                  <a:pt x="24006" y="37616"/>
+                                  <a:pt x="21576" y="38100"/>
+                                  <a:pt x="19050" y="38100"/>
+                                </a:cubicBezTo>
+                                <a:cubicBezTo>
+                                  <a:pt x="16524" y="38100"/>
+                                  <a:pt x="14094" y="37616"/>
+                                  <a:pt x="11760" y="36649"/>
+                                </a:cubicBezTo>
+                                <a:cubicBezTo>
+                                  <a:pt x="9426" y="35682"/>
+                                  <a:pt x="7366" y="34306"/>
+                                  <a:pt x="5580" y="32520"/>
+                                </a:cubicBezTo>
+                                <a:cubicBezTo>
+                                  <a:pt x="3793" y="30733"/>
+                                  <a:pt x="2417" y="28673"/>
+                                  <a:pt x="1450" y="26339"/>
+                                </a:cubicBezTo>
+                                <a:cubicBezTo>
+                                  <a:pt x="483" y="24006"/>
+                                  <a:pt x="0" y="21576"/>
+                                  <a:pt x="0" y="19050"/>
+                                </a:cubicBezTo>
+                                <a:cubicBezTo>
+                                  <a:pt x="0" y="16524"/>
+                                  <a:pt x="483" y="14093"/>
+                                  <a:pt x="1450" y="11760"/>
+                                </a:cubicBezTo>
+                                <a:cubicBezTo>
+                                  <a:pt x="2417" y="9426"/>
+                                  <a:pt x="3793" y="7366"/>
+                                  <a:pt x="5580" y="5580"/>
+                                </a:cubicBezTo>
+                                <a:cubicBezTo>
+                                  <a:pt x="7366" y="3793"/>
+                                  <a:pt x="9426" y="2417"/>
+                                  <a:pt x="11760" y="1450"/>
+                                </a:cubicBezTo>
+                                <a:cubicBezTo>
+                                  <a:pt x="14094" y="483"/>
+                                  <a:pt x="16524" y="0"/>
+                                  <a:pt x="19050" y="0"/>
+                                </a:cubicBezTo>
+                                <a:close/>
+                              </a:path>
+                            </a:pathLst>
+                          </a:custGeom>
+                          <a:solidFill>
+                            <a:srgbClr val="172033"/>
+                          </a:solidFill>
+                          <a:ln w="0" cap="flat">
+                            <a:noFill/>
+                            <a:miter lim="127000"/>
+                          </a:ln>
+                          <a:effectLst/>
+                        </wps:spPr>
+                        <wps:bodyPr/>
+                      </wps:wsp>
+                    </wpg:wgp>
+                  </a:graphicData>
+                </a:graphic>
+              </wp:inline>
+            </w:drawing>
+          </mc:Choice>
+          <mc:Fallback>
+            <w:pict>
+              <v:group w14:anchorId="43189DDA" id="Group 1008" o:spid="_x0000_s1026" style="width:3pt;height:3pt;mso-position-horizontal-relative:char;mso-position-vertical-relative:line" coordsize="38100,38100" o:gfxdata="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">
+                <v:shape id="Shape 33" o:spid="_x0000_s1027" style="position:absolute;width:38100;height:38100;visibility:visible;mso-wrap-style:square;v-text-anchor:top" coordsize="38100,38100" o:gfxdata="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" path="m19050,v2526,,4956,483,7290,1450c28674,2417,30734,3793,32520,5580v1787,1786,3163,3846,4130,6180c37617,14093,38100,16524,38100,19050v,2526,-483,4956,-1450,7289c35683,28673,34307,30733,32520,32520v-1786,1786,-3846,3162,-6180,4129c24006,37616,21576,38100,19050,38100v-2526,,-4956,-484,-7290,-1451c9426,35682,7366,34306,5580,32520,3793,30733,2417,28673,1450,26339,483,24006,,21576,,19050,,16524,483,14093,1450,11760,2417,9426,3793,7366,5580,5580,7366,3793,9426,2417,11760,1450,14094,483,16524,,19050,xe" fillcolor="#172033" stroked="f" strokeweight="0">
+                  <v:stroke miterlimit="83231f" joinstyle="miter"/>
+                  <v:path arrowok="t" textboxrect="0,0,38100,38100"/>
+                </v:shape>
+                <w10:anchorlock/>
+              </v:group>
+            </w:pict>
+          </mc:Fallback>
+        </mc:AlternateContent>
+      </w:r>
+      <w:r>
+        <w:rPr>
+          <w:rFonts w:ascii="Times New Roman" w:eastAsia="Calibri" w:hAnsi="Times New Roman" w:cs="Times New Roman"/>
+          <w:b/>
+          <w:sz w:val="20"/>
         </w:rPr>
         <w:tab/>
-      </w:r>
-      <w:r>
-        <w:rPr>
-          <w:rFonts w:ascii="Times New Roman" w:hAnsi="Times New Roman" w:cs="Times New Roman"/>
-        </w:rPr>
-        <w:tab/>
-      </w:r>
-      <w:r>
-        <w:rPr>
-          <w:rFonts w:ascii="Times New Roman" w:hAnsi="Times New Roman" w:cs="Times New Roman"/>
-        </w:rPr>
-        <w:tab/>
-      </w:r>
-      <w:r>
-        <w:rPr>
-          <w:rFonts w:ascii="Times New Roman" w:hAnsi="Times New Roman" w:cs="Times New Roman"/>
-        </w:rPr>
-        <w:tab/>
-      </w:r>
-      <w:r>
-        <w:rPr>
-          <w:rFonts w:ascii="Times New Roman" w:hAnsi="Times New Roman" w:cs="Times New Roman"/>
-        </w:rPr>
-        <w:tab/>
-        <w:t xml:space="preserve">        September 2025 – January 2026</w:t>
+        <w:t>Relevant coursework:</w:t>
+      </w:r>
+      <w:r>
+        <w:rPr>
+          <w:rFonts w:ascii="Times New Roman" w:eastAsia="Calibri" w:hAnsi="Times New Roman" w:cs="Times New Roman"/>
+          <w:sz w:val="20"/>
+        </w:rPr>
+        <w:t xml:space="preserve"> Introduction to  Cybersecurity, Data Communications, Database I, Malware Analysis, Cyber Crime Investigation,  Ransomware Defense, and research topics in the NIST Cybersecurity Framework.</w:t>
       </w:r>
     </w:p>
     <w:p>
       <w:pPr>
-        <w:spacing w:after="0"/>
-        <w:rPr>
-          <w:rFonts w:ascii="Times New Roman" w:hAnsi="Times New Roman" w:cs="Times New Roman"/>
-        </w:rPr>
-      </w:pPr>
-      <w:r>
-        <w:rPr>
-          <w:rFonts w:ascii="Times New Roman" w:hAnsi="Times New Roman" w:cs="Times New Roman"/>
-        </w:rPr>
-        <w:t>Identifying the Challenges of Using AI in the Corporate World</w:t>
+        <w:keepNext/>
+        <w:keepLines/>
+        <w:spacing w:after="70" w:line="259" w:lineRule="auto"/>
+        <w:ind w:left="-5" w:hanging="10"/>
+        <w:outlineLvl w:val="0"/>
+        <w:rPr>
+          <w:rFonts w:ascii="Times New Roman" w:eastAsia="Calibri" w:hAnsi="Times New Roman" w:cs="Times New Roman"/>
+          <w:b/>
+          <w:sz w:val="21"/>
+        </w:rPr>
+      </w:pPr>
+      <w:r>
+        <w:rPr>
+          <w:rFonts w:ascii="Times New Roman" w:eastAsia="Calibri" w:hAnsi="Times New Roman" w:cs="Times New Roman"/>
+          <w:b/>
+          <w:sz w:val="21"/>
+        </w:rPr>
+        <w:t>SECURITY PROJECTS</w:t>
       </w:r>
     </w:p>
     <w:p>
       <w:pPr>
-        <w:pStyle w:val="ListParagraph"/>
+        <w:tabs>
+          <w:tab w:val="right" w:pos="10455"/>
+        </w:tabs>
+        <w:spacing w:after="43" w:line="259" w:lineRule="auto"/>
+        <w:ind w:left="-15" w:right="-15"/>
+        <w:rPr>
+          <w:rFonts w:ascii="Times New Roman" w:eastAsia="Calibri" w:hAnsi="Times New Roman" w:cs="Times New Roman"/>
+          <w:sz w:val="20"/>
+        </w:rPr>
+      </w:pPr>
+      <w:r>
+        <w:rPr>
+          <w:rFonts w:ascii="Times New Roman" w:eastAsia="Calibri" w:hAnsi="Times New Roman" w:cs="Times New Roman"/>
+          <w:b/>
+          <w:sz w:val="20"/>
+        </w:rPr>
+        <w:t>MassCyberCenter Mentorship Program - Enterprise AI Security Research</w:t>
+      </w:r>
+      <w:r>
+        <w:rPr>
+          <w:rFonts w:ascii="Times New Roman" w:eastAsia="Calibri" w:hAnsi="Times New Roman" w:cs="Times New Roman"/>
+          <w:b/>
+          <w:sz w:val="20"/>
+        </w:rPr>
+        <w:tab/>
+      </w:r>
+      <w:r>
+        <w:rPr>
+          <w:rFonts w:ascii="Times New Roman" w:eastAsia="Calibri" w:hAnsi="Times New Roman" w:cs="Times New Roman"/>
+          <w:sz w:val="19"/>
+        </w:rPr>
+        <w:t>Sep 2025 - Jan 2026</w:t>
+      </w:r>
+    </w:p>
+    <w:p>
+      <w:pPr>
         <w:numPr>
           <w:ilvl w:val="0"/>
-          <w:numId w:val="4"/>
+          <w:numId w:val="5"/>
         </w:numPr>
-        <w:spacing w:after="0"/>
-        <w:rPr>
-          <w:rFonts w:ascii="Times New Roman" w:hAnsi="Times New Roman" w:cs="Times New Roman"/>
-        </w:rPr>
-      </w:pPr>
-      <w:r>
-        <w:rPr>
-          <w:rFonts w:ascii="Times New Roman" w:hAnsi="Times New Roman" w:cs="Times New Roman"/>
-        </w:rPr>
-        <w:t>Researched cybersecurity challenges associated with enterprise AI adoption, including data privacy, access control, and AI-related security risks.</w:t>
+        <w:spacing w:after="11" w:line="256" w:lineRule="auto"/>
+        <w:contextualSpacing/>
+        <w:rPr>
+          <w:rFonts w:ascii="Times New Roman" w:eastAsia="Calibri" w:hAnsi="Times New Roman" w:cs="Times New Roman"/>
+          <w:sz w:val="20"/>
+        </w:rPr>
+      </w:pPr>
+      <w:r>
+        <w:rPr>
+          <w:rFonts w:ascii="Times New Roman" w:eastAsia="Calibri" w:hAnsi="Times New Roman" w:cs="Times New Roman"/>
+          <w:sz w:val="20"/>
+        </w:rPr>
+        <w:t>Researched cybersecurity risks in enterprise artificial intelligence adoption, including data privacy, access control, data exposure, and governance concerns.</w:t>
       </w:r>
     </w:p>
     <w:p>
       <w:pPr>
-        <w:pStyle w:val="ListParagraph"/>
         <w:numPr>
           <w:ilvl w:val="0"/>
-          <w:numId w:val="4"/>
+          <w:numId w:val="5"/>
         </w:numPr>
-        <w:spacing w:after="0"/>
-        <w:rPr>
-          <w:rFonts w:ascii="Times New Roman" w:hAnsi="Times New Roman" w:cs="Times New Roman"/>
-        </w:rPr>
-      </w:pPr>
-      <w:r>
-        <w:rPr>
-          <w:rFonts w:ascii="Times New Roman" w:hAnsi="Times New Roman" w:cs="Times New Roman"/>
-        </w:rPr>
-        <w:t>Analyzed risks of public versus private AI tools, including potential data exposure, unauthorized access, and governance concerns.</w:t>
+        <w:spacing w:after="11" w:line="256" w:lineRule="auto"/>
+        <w:contextualSpacing/>
+        <w:rPr>
+          <w:rFonts w:ascii="Times New Roman" w:eastAsia="Calibri" w:hAnsi="Times New Roman" w:cs="Times New Roman"/>
+          <w:sz w:val="20"/>
+        </w:rPr>
+      </w:pPr>
+      <w:r>
+        <w:rPr>
+          <w:rFonts w:ascii="Times New Roman" w:eastAsia="Calibri" w:hAnsi="Times New Roman" w:cs="Times New Roman"/>
+          <w:sz w:val="20"/>
+        </w:rPr>
+        <w:t>Evaluated public and private AI tools and translated findings into policy recommendations and technical safeguards for more secure organizational use.</w:t>
       </w:r>
     </w:p>
     <w:p>
       <w:pPr>
-        <w:pStyle w:val="ListParagraph"/>
-        <w:numPr>
-          <w:ilvl w:val="0"/>
-          <w:numId w:val="4"/>
-        </w:numPr>
-        <w:spacing w:after="0"/>
-        <w:rPr>
-          <w:rFonts w:ascii="Times New Roman" w:hAnsi="Times New Roman" w:cs="Times New Roman"/>
-        </w:rPr>
-      </w:pPr>
-      <w:r>
-        <w:rPr>
-          <w:rFonts w:ascii="Times New Roman" w:hAnsi="Times New Roman" w:cs="Times New Roman"/>
-        </w:rPr>
-        <w:t>Proposed</w:t>
-      </w:r>
-      <w:r>
-        <w:rPr>
-          <w:rFonts w:ascii="Times New Roman" w:hAnsi="Times New Roman" w:cs="Times New Roman"/>
-        </w:rPr>
-        <w:t xml:space="preserve"> policy-based recommendations and technical safeguards </w:t>
-      </w:r>
-      <w:r>
-        <w:rPr>
-          <w:rFonts w:ascii="Times New Roman" w:hAnsi="Times New Roman" w:cs="Times New Roman"/>
-        </w:rPr>
-        <w:t>to improve secure AI adoption within organizations.</w:t>
+        <w:tabs>
+          <w:tab w:val="right" w:pos="10455"/>
+        </w:tabs>
+        <w:spacing w:after="0" w:line="259" w:lineRule="auto"/>
+        <w:ind w:left="-15" w:right="-15"/>
+        <w:rPr>
+          <w:rFonts w:ascii="Times New Roman" w:eastAsia="Calibri" w:hAnsi="Times New Roman" w:cs="Times New Roman"/>
+          <w:sz w:val="20"/>
+        </w:rPr>
+      </w:pPr>
+      <w:r>
+        <w:rPr>
+          <w:rFonts w:ascii="Times New Roman" w:eastAsia="Calibri" w:hAnsi="Times New Roman" w:cs="Times New Roman"/>
+          <w:b/>
+          <w:sz w:val="20"/>
+        </w:rPr>
+        <w:t>PassVault - Secure Desktop Password Manager</w:t>
+      </w:r>
+      <w:r>
+        <w:rPr>
+          <w:rFonts w:ascii="Times New Roman" w:eastAsia="Calibri" w:hAnsi="Times New Roman" w:cs="Times New Roman"/>
+          <w:b/>
+          <w:sz w:val="20"/>
+        </w:rPr>
+        <w:tab/>
+      </w:r>
+      <w:r>
+        <w:rPr>
+          <w:rFonts w:ascii="Times New Roman" w:eastAsia="Calibri" w:hAnsi="Times New Roman" w:cs="Times New Roman"/>
+          <w:sz w:val="19"/>
+        </w:rPr>
+        <w:t>Jul 2026 - Aug 2026</w:t>
       </w:r>
     </w:p>
     <w:p>
       <w:pPr>
-        <w:spacing w:after="0"/>
-        <w:rPr>
-          <w:rFonts w:ascii="Times New Roman" w:hAnsi="Times New Roman" w:cs="Times New Roman"/>
-          <w:b/>
-          <w:bCs/>
-          <w:sz w:val="36"/>
-          <w:szCs w:val="36"/>
-        </w:rPr>
-      </w:pPr>
-      <w:r>
-        <w:rPr>
-          <w:rFonts w:ascii="Times New Roman" w:hAnsi="Times New Roman" w:cs="Times New Roman"/>
-          <w:b/>
-          <w:bCs/>
-          <w:sz w:val="36"/>
-          <w:szCs w:val="36"/>
-        </w:rPr>
-        <w:t>Professional Experience</w:t>
+        <w:spacing w:after="52" w:line="259" w:lineRule="auto"/>
+        <w:ind w:left="-5" w:hanging="10"/>
+        <w:rPr>
+          <w:rFonts w:ascii="Times New Roman" w:eastAsia="Calibri" w:hAnsi="Times New Roman" w:cs="Times New Roman"/>
+          <w:sz w:val="20"/>
+        </w:rPr>
+      </w:pPr>
+      <w:r>
+        <w:rPr>
+          <w:rFonts w:ascii="Times New Roman" w:eastAsia="Calibri" w:hAnsi="Times New Roman" w:cs="Times New Roman"/>
+          <w:i/>
+          <w:sz w:val="19"/>
+        </w:rPr>
+        <w:t>Python, CustomTkinter</w:t>
       </w:r>
     </w:p>
     <w:p>
       <w:pPr>
-        <w:spacing w:after="0"/>
-        <w:rPr>
-          <w:rFonts w:ascii="Times New Roman" w:hAnsi="Times New Roman" w:cs="Times New Roman"/>
-          <w:sz w:val="32"/>
-          <w:szCs w:val="32"/>
-        </w:rPr>
-      </w:pPr>
-      <w:r>
-        <w:rPr>
-          <w:rFonts w:ascii="Times New Roman" w:hAnsi="Times New Roman" w:cs="Times New Roman"/>
-        </w:rPr>
-        <w:t>University of Massachusetts Lowell, Lowell, Massachusetts</w:t>
-      </w:r>
-      <w:r>
-        <w:rPr>
-          <w:rFonts w:ascii="Times New Roman" w:hAnsi="Times New Roman" w:cs="Times New Roman"/>
-        </w:rPr>
-        <w:t xml:space="preserve"> </w:t>
-      </w:r>
-      <w:r>
-        <w:rPr>
-          <w:rFonts w:ascii="Times New Roman" w:hAnsi="Times New Roman" w:cs="Times New Roman"/>
-        </w:rPr>
-        <w:tab/>
-      </w:r>
-      <w:r>
-        <w:rPr>
-          <w:rFonts w:ascii="Times New Roman" w:hAnsi="Times New Roman" w:cs="Times New Roman"/>
-        </w:rPr>
-        <w:tab/>
-      </w:r>
-      <w:r>
-        <w:rPr>
-          <w:rFonts w:ascii="Times New Roman" w:hAnsi="Times New Roman" w:cs="Times New Roman"/>
-        </w:rPr>
-        <w:tab/>
-      </w:r>
-      <w:r>
-        <w:rPr>
-          <w:rFonts w:ascii="Times New Roman" w:hAnsi="Times New Roman" w:cs="Times New Roman"/>
-        </w:rPr>
-        <w:tab/>
-      </w:r>
-      <w:r>
-        <w:rPr>
-          <w:rFonts w:ascii="Times New Roman" w:hAnsi="Times New Roman" w:cs="Times New Roman"/>
-        </w:rPr>
-        <w:t xml:space="preserve">    </w:t>
-      </w:r>
-      <w:r>
-        <w:rPr>
-          <w:rFonts w:ascii="Times New Roman" w:hAnsi="Times New Roman" w:cs="Times New Roman"/>
-        </w:rPr>
-        <w:t>June 2023 - Present</w:t>
+        <w:spacing w:after="11" w:line="256" w:lineRule="auto"/>
+        <w:ind w:left="10" w:hanging="10"/>
+        <w:rPr>
+          <w:rFonts w:ascii="Times New Roman" w:eastAsia="Calibri" w:hAnsi="Times New Roman" w:cs="Times New Roman"/>
+          <w:sz w:val="20"/>
+        </w:rPr>
+      </w:pPr>
+      <w:r>
+        <w:rPr>
+          <w:rFonts w:ascii="Times New Roman" w:eastAsia="Calibri" w:hAnsi="Times New Roman" w:cs="Times New Roman"/>
+          <w:noProof/>
+          <w:sz w:val="22"/>
+        </w:rPr>
+        <mc:AlternateContent>
+          <mc:Choice Requires="wpg">
+            <w:drawing>
+              <wp:anchor distT="0" distB="0" distL="114300" distR="114300" simplePos="0" relativeHeight="251659264" behindDoc="0" locked="0" layoutInCell="1" allowOverlap="1" wp14:anchorId="50166B12" wp14:editId="071679EB">
+                <wp:simplePos x="0" y="0"/>
+                <wp:positionH relativeFrom="column">
+                  <wp:posOffset>23664</wp:posOffset>
+                </wp:positionH>
+                <wp:positionV relativeFrom="paragraph">
+                  <wp:posOffset>35287</wp:posOffset>
+                </wp:positionV>
+                <wp:extent cx="38100" cy="371475"/>
+                <wp:effectExtent l="0" t="0" r="0" b="0"/>
+                <wp:wrapSquare wrapText="bothSides"/>
+                <wp:docPr id="1009" name="Group 1009"/>
+                <wp:cNvGraphicFramePr/>
+                <a:graphic xmlns:a="http://schemas.openxmlformats.org/drawingml/2006/main">
+                  <a:graphicData uri="http://schemas.microsoft.com/office/word/2010/wordprocessingGroup">
+                    <wpg:wgp>
+                      <wpg:cNvGrpSpPr/>
+                      <wpg:grpSpPr>
+                        <a:xfrm>
+                          <a:off x="0" y="0"/>
+                          <a:ext cx="38100" cy="371475"/>
+                          <a:chOff x="0" y="0"/>
+                          <a:chExt cx="38100" cy="371475"/>
+                        </a:xfrm>
+                      </wpg:grpSpPr>
+                      <wps:wsp>
+                        <wps:cNvPr id="49" name="Shape 49"/>
+                        <wps:cNvSpPr/>
+                        <wps:spPr>
+                          <a:xfrm>
+                            <a:off x="0" y="0"/>
+                            <a:ext cx="38100" cy="38100"/>
+                          </a:xfrm>
+                          <a:custGeom>
+                            <a:avLst/>
+                            <a:gdLst/>
+                            <a:ahLst/>
+                            <a:cxnLst/>
+                            <a:rect l="0" t="0" r="0" b="0"/>
+                            <a:pathLst>
+                              <a:path w="38100" h="38100">
+                                <a:moveTo>
+                                  <a:pt x="19050" y="0"/>
+                                </a:moveTo>
+                                <a:cubicBezTo>
+                                  <a:pt x="21576" y="0"/>
+                                  <a:pt x="24006" y="483"/>
+                                  <a:pt x="26340" y="1450"/>
+                                </a:cubicBezTo>
+                                <a:cubicBezTo>
+                                  <a:pt x="28674" y="2417"/>
+                                  <a:pt x="30734" y="3793"/>
+                                  <a:pt x="32520" y="5579"/>
+                                </a:cubicBezTo>
+                                <a:cubicBezTo>
+                                  <a:pt x="34307" y="7365"/>
+                                  <a:pt x="35683" y="9425"/>
+                                  <a:pt x="36650" y="11759"/>
+                                </a:cubicBezTo>
+                                <a:cubicBezTo>
+                                  <a:pt x="37617" y="14093"/>
+                                  <a:pt x="38100" y="16523"/>
+                                  <a:pt x="38100" y="19050"/>
+                                </a:cubicBezTo>
+                                <a:cubicBezTo>
+                                  <a:pt x="38100" y="21576"/>
+                                  <a:pt x="37617" y="24006"/>
+                                  <a:pt x="36650" y="26339"/>
+                                </a:cubicBezTo>
+                                <a:cubicBezTo>
+                                  <a:pt x="35683" y="28673"/>
+                                  <a:pt x="34307" y="30733"/>
+                                  <a:pt x="32520" y="32520"/>
+                                </a:cubicBezTo>
+                                <a:cubicBezTo>
+                                  <a:pt x="30734" y="34306"/>
+                                  <a:pt x="28674" y="35682"/>
+                                  <a:pt x="26340" y="36649"/>
+                                </a:cubicBezTo>
+                                <a:cubicBezTo>
+                                  <a:pt x="24006" y="37616"/>
+                                  <a:pt x="21576" y="38099"/>
+                                  <a:pt x="19050" y="38100"/>
+                                </a:cubicBezTo>
+                                <a:cubicBezTo>
+                                  <a:pt x="16524" y="38099"/>
+                                  <a:pt x="14094" y="37616"/>
+                                  <a:pt x="11760" y="36649"/>
+                                </a:cubicBezTo>
+                                <a:cubicBezTo>
+                                  <a:pt x="9426" y="35682"/>
+                                  <a:pt x="7366" y="34306"/>
+                                  <a:pt x="5580" y="32520"/>
+                                </a:cubicBezTo>
+                                <a:cubicBezTo>
+                                  <a:pt x="3793" y="30733"/>
+                                  <a:pt x="2417" y="28673"/>
+                                  <a:pt x="1450" y="26339"/>
+                                </a:cubicBezTo>
+                                <a:cubicBezTo>
+                                  <a:pt x="483" y="24006"/>
+                                  <a:pt x="0" y="21576"/>
+                                  <a:pt x="0" y="19050"/>
+                                </a:cubicBezTo>
+                                <a:cubicBezTo>
+                                  <a:pt x="0" y="16523"/>
+                                  <a:pt x="483" y="14093"/>
+                                  <a:pt x="1450" y="11759"/>
+                                </a:cubicBezTo>
+                                <a:cubicBezTo>
+                                  <a:pt x="2417" y="9425"/>
+                                  <a:pt x="3793" y="7365"/>
+                                  <a:pt x="5580" y="5579"/>
+                                </a:cubicBezTo>
+                                <a:cubicBezTo>
+                                  <a:pt x="7366" y="3793"/>
+                                  <a:pt x="9426" y="2417"/>
+                                  <a:pt x="11760" y="1450"/>
+                                </a:cubicBezTo>
+                                <a:cubicBezTo>
+                                  <a:pt x="14094" y="483"/>
+                                  <a:pt x="16524" y="0"/>
+                                  <a:pt x="19050" y="0"/>
+                                </a:cubicBezTo>
+                                <a:close/>
+                              </a:path>
+                            </a:pathLst>
+                          </a:custGeom>
+                          <a:solidFill>
+                            <a:srgbClr val="172033"/>
+                          </a:solidFill>
+                          <a:ln w="0" cap="flat">
+                            <a:noFill/>
+                            <a:miter lim="127000"/>
+                          </a:ln>
+                          <a:effectLst/>
+                        </wps:spPr>
+                        <wps:bodyPr/>
+                      </wps:wsp>
+                      <wps:wsp>
+                        <wps:cNvPr id="52" name="Shape 52"/>
+                        <wps:cNvSpPr/>
+                        <wps:spPr>
+                          <a:xfrm>
+                            <a:off x="0" y="333375"/>
+                            <a:ext cx="38100" cy="38100"/>
+                          </a:xfrm>
+                          <a:custGeom>
+                            <a:avLst/>
+                            <a:gdLst/>
+                            <a:ahLst/>
+                            <a:cxnLst/>
+                            <a:rect l="0" t="0" r="0" b="0"/>
+                            <a:pathLst>
+                              <a:path w="38100" h="38100">
+                                <a:moveTo>
+                                  <a:pt x="19050" y="0"/>
+                                </a:moveTo>
+                                <a:cubicBezTo>
+                                  <a:pt x="21576" y="0"/>
+                                  <a:pt x="24006" y="483"/>
+                                  <a:pt x="26340" y="1449"/>
+                                </a:cubicBezTo>
+                                <a:cubicBezTo>
+                                  <a:pt x="28674" y="2416"/>
+                                  <a:pt x="30734" y="3793"/>
+                                  <a:pt x="32520" y="5579"/>
+                                </a:cubicBezTo>
+                                <a:cubicBezTo>
+                                  <a:pt x="34307" y="7365"/>
+                                  <a:pt x="35683" y="9425"/>
+                                  <a:pt x="36650" y="11759"/>
+                                </a:cubicBezTo>
+                                <a:cubicBezTo>
+                                  <a:pt x="37617" y="14093"/>
+                                  <a:pt x="38100" y="16523"/>
+                                  <a:pt x="38100" y="19050"/>
+                                </a:cubicBezTo>
+                                <a:cubicBezTo>
+                                  <a:pt x="38100" y="21575"/>
+                                  <a:pt x="37617" y="24005"/>
+                                  <a:pt x="36650" y="26339"/>
+                                </a:cubicBezTo>
+                                <a:cubicBezTo>
+                                  <a:pt x="35683" y="28673"/>
+                                  <a:pt x="34307" y="30733"/>
+                                  <a:pt x="32520" y="32519"/>
+                                </a:cubicBezTo>
+                                <a:cubicBezTo>
+                                  <a:pt x="30734" y="34305"/>
+                                  <a:pt x="28674" y="35682"/>
+                                  <a:pt x="26340" y="36649"/>
+                                </a:cubicBezTo>
+                                <a:cubicBezTo>
+                                  <a:pt x="24006" y="37616"/>
+                                  <a:pt x="21576" y="38099"/>
+                                  <a:pt x="19050" y="38100"/>
+                                </a:cubicBezTo>
+                                <a:cubicBezTo>
+                                  <a:pt x="16524" y="38099"/>
+                                  <a:pt x="14094" y="37616"/>
+                                  <a:pt x="11760" y="36649"/>
+                                </a:cubicBezTo>
+                                <a:cubicBezTo>
+                                  <a:pt x="9426" y="35682"/>
+                                  <a:pt x="7366" y="34305"/>
+                                  <a:pt x="5580" y="32519"/>
+                                </a:cubicBezTo>
+                                <a:cubicBezTo>
+                                  <a:pt x="3793" y="30733"/>
+                                  <a:pt x="2417" y="28673"/>
+                                  <a:pt x="1450" y="26339"/>
+                                </a:cubicBezTo>
+                                <a:cubicBezTo>
+                                  <a:pt x="483" y="24005"/>
+                                  <a:pt x="0" y="21575"/>
+                                  <a:pt x="0" y="19050"/>
+                                </a:cubicBezTo>
+                                <a:cubicBezTo>
+                                  <a:pt x="0" y="16523"/>
+                                  <a:pt x="483" y="14093"/>
+                                  <a:pt x="1450" y="11759"/>
+                                </a:cubicBezTo>
+                                <a:cubicBezTo>
+                                  <a:pt x="2417" y="9425"/>
+                                  <a:pt x="3793" y="7365"/>
+                                  <a:pt x="5580" y="5579"/>
+                                </a:cubicBezTo>
+                                <a:cubicBezTo>
+                                  <a:pt x="7366" y="3793"/>
+                                  <a:pt x="9426" y="2416"/>
+                                  <a:pt x="11760" y="1449"/>
+                                </a:cubicBezTo>
+                                <a:cubicBezTo>
+                                  <a:pt x="14094" y="483"/>
+                                  <a:pt x="16524" y="0"/>
+                                  <a:pt x="19050" y="0"/>
+                                </a:cubicBezTo>
+                                <a:close/>
+                              </a:path>
+                            </a:pathLst>
+                          </a:custGeom>
+                          <a:solidFill>
+                            <a:srgbClr val="172033"/>
+                          </a:solidFill>
+                          <a:ln w="0" cap="flat">
+                            <a:noFill/>
+                            <a:miter lim="127000"/>
+                          </a:ln>
+                          <a:effectLst/>
+                        </wps:spPr>
+                        <wps:bodyPr/>
+                      </wps:wsp>
+                    </wpg:wgp>
+                  </a:graphicData>
+                </a:graphic>
+              </wp:anchor>
+            </w:drawing>
+          </mc:Choice>
+          <mc:Fallback>
+            <w:pict>
+              <v:group w14:anchorId="4C1078C1" id="Group 1009" o:spid="_x0000_s1026" style="position:absolute;margin-left:1.85pt;margin-top:2.8pt;width:3pt;height:29.25pt;z-index:251659264" coordsize="38100,371475" o:gfxdata="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">
+                <v:shape id="Shape 49" o:spid="_x0000_s1027" style="position:absolute;width:38100;height:38100;visibility:visible;mso-wrap-style:square;v-text-anchor:top" coordsize="38100,38100" o:gfxdata="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" path="m19050,v2526,,4956,483,7290,1450c28674,2417,30734,3793,32520,5579v1787,1786,3163,3846,4130,6180c37617,14093,38100,16523,38100,19050v,2526,-483,4956,-1450,7289c35683,28673,34307,30733,32520,32520v-1786,1786,-3846,3162,-6180,4129c24006,37616,21576,38099,19050,38100v-2526,-1,-4956,-484,-7290,-1451c9426,35682,7366,34306,5580,32520,3793,30733,2417,28673,1450,26339,483,24006,,21576,,19050,,16523,483,14093,1450,11759,2417,9425,3793,7365,5580,5579,7366,3793,9426,2417,11760,1450,14094,483,16524,,19050,xe" fillcolor="#172033" stroked="f" strokeweight="0">
+                  <v:stroke miterlimit="83231f" joinstyle="miter"/>
+                  <v:path arrowok="t" textboxrect="0,0,38100,38100"/>
+                </v:shape>
+                <v:shape id="Shape 52" o:spid="_x0000_s1028" style="position:absolute;top:333375;width:38100;height:38100;visibility:visible;mso-wrap-style:square;v-text-anchor:top" coordsize="38100,38100" o:gfxdata="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" path="m19050,v2526,,4956,483,7290,1449c28674,2416,30734,3793,32520,5579v1787,1786,3163,3846,4130,6180c37617,14093,38100,16523,38100,19050v,2525,-483,4955,-1450,7289c35683,28673,34307,30733,32520,32519v-1786,1786,-3846,3163,-6180,4130c24006,37616,21576,38099,19050,38100v-2526,-1,-4956,-484,-7290,-1451c9426,35682,7366,34305,5580,32519,3793,30733,2417,28673,1450,26339,483,24005,,21575,,19050,,16523,483,14093,1450,11759,2417,9425,3793,7365,5580,5579,7366,3793,9426,2416,11760,1449,14094,483,16524,,19050,xe" fillcolor="#172033" stroked="f" strokeweight="0">
+                  <v:stroke miterlimit="83231f" joinstyle="miter"/>
+                  <v:path arrowok="t" textboxrect="0,0,38100,38100"/>
+                </v:shape>
+                <w10:wrap type="square"/>
+              </v:group>
+            </w:pict>
+          </mc:Fallback>
+        </mc:AlternateContent>
+      </w:r>
+      <w:r>
+        <w:rPr>
+          <w:rFonts w:ascii="Times New Roman" w:eastAsia="Calibri" w:hAnsi="Times New Roman" w:cs="Times New Roman"/>
+          <w:sz w:val="20"/>
+        </w:rPr>
+        <w:t>Designed and built an independent desktop password manager with encrypted credential storage and master password authentication.</w:t>
       </w:r>
     </w:p>
     <w:p>
       <w:pPr>
-        <w:spacing w:after="0"/>
-        <w:rPr>
-          <w:rFonts w:ascii="Times New Roman" w:hAnsi="Times New Roman" w:cs="Times New Roman"/>
-        </w:rPr>
-      </w:pPr>
-      <w:r>
-        <w:rPr>
-          <w:rFonts w:ascii="Times New Roman" w:hAnsi="Times New Roman" w:cs="Times New Roman"/>
-        </w:rPr>
-        <w:t>Building Manager</w:t>
+        <w:spacing w:after="116" w:line="256" w:lineRule="auto"/>
+        <w:ind w:left="265" w:hanging="10"/>
+        <w:rPr>
+          <w:rFonts w:ascii="Times New Roman" w:eastAsia="Calibri" w:hAnsi="Times New Roman" w:cs="Times New Roman"/>
+          <w:sz w:val="20"/>
+        </w:rPr>
+      </w:pPr>
+      <w:r>
+        <w:rPr>
+          <w:rFonts w:ascii="Times New Roman" w:eastAsia="Calibri" w:hAnsi="Times New Roman" w:cs="Times New Roman"/>
+          <w:sz w:val="20"/>
+        </w:rPr>
+        <w:t>Implemented secure password generation and file-handling workflows to create, store, and manage protected credentials.</w:t>
       </w:r>
     </w:p>
     <w:p>
       <w:pPr>
-        <w:pStyle w:val="ListParagraph"/>
-        <w:numPr>
-          <w:ilvl w:val="0"/>
-          <w:numId w:val="2"/>
-        </w:numPr>
-        <w:spacing w:after="0"/>
-        <w:rPr>
-          <w:rFonts w:ascii="Times New Roman" w:hAnsi="Times New Roman" w:cs="Times New Roman"/>
-        </w:rPr>
-      </w:pPr>
-      <w:r>
-        <w:rPr>
-          <w:rFonts w:ascii="Times New Roman" w:hAnsi="Times New Roman" w:cs="Times New Roman"/>
-        </w:rPr>
-        <w:t>Coordinated events in Meehan T Martin student center</w:t>
-      </w:r>
-      <w:r>
-        <w:rPr>
-          <w:rFonts w:ascii="Times New Roman" w:hAnsi="Times New Roman" w:cs="Times New Roman"/>
-        </w:rPr>
-        <w:t xml:space="preserve"> conference rooms, ensuring smooth execution and client sati</w:t>
-      </w:r>
-      <w:r>
-        <w:rPr>
-          <w:rFonts w:ascii="Times New Roman" w:hAnsi="Times New Roman" w:cs="Times New Roman"/>
-        </w:rPr>
-        <w:t>sfaction.</w:t>
+        <w:keepNext/>
+        <w:keepLines/>
+        <w:spacing w:after="0" w:line="259" w:lineRule="auto"/>
+        <w:ind w:left="-5" w:hanging="10"/>
+        <w:outlineLvl w:val="0"/>
+        <w:rPr>
+          <w:rFonts w:ascii="Times New Roman" w:eastAsia="Calibri" w:hAnsi="Times New Roman" w:cs="Times New Roman"/>
+          <w:b/>
+          <w:sz w:val="21"/>
+        </w:rPr>
+      </w:pPr>
+      <w:r>
+        <w:rPr>
+          <w:rFonts w:ascii="Times New Roman" w:eastAsia="Calibri" w:hAnsi="Times New Roman" w:cs="Times New Roman"/>
+          <w:b/>
+          <w:sz w:val="21"/>
+        </w:rPr>
+        <w:t>PROFESSIONAL EXPERIENCE</w:t>
       </w:r>
     </w:p>
     <w:p>
       <w:pPr>
-        <w:pStyle w:val="ListParagraph"/>
-        <w:numPr>
-          <w:ilvl w:val="0"/>
-          <w:numId w:val="2"/>
-        </w:numPr>
-        <w:spacing w:after="0"/>
-        <w:rPr>
-          <w:rFonts w:ascii="Times New Roman" w:hAnsi="Times New Roman" w:cs="Times New Roman"/>
-        </w:rPr>
-      </w:pPr>
-      <w:r>
-        <w:rPr>
-          <w:rFonts w:ascii="Times New Roman" w:hAnsi="Times New Roman" w:cs="Times New Roman"/>
-        </w:rPr>
-        <w:t>Performed regular rounds ensuring the building I worked in is up to standards</w:t>
-      </w:r>
-      <w:r>
-        <w:rPr>
-          <w:rFonts w:ascii="Times New Roman" w:hAnsi="Times New Roman" w:cs="Times New Roman"/>
-        </w:rPr>
-        <w:t xml:space="preserve"> and addressing any issue as they arose.</w:t>
+        <w:tabs>
+          <w:tab w:val="right" w:pos="10455"/>
+        </w:tabs>
+        <w:spacing w:after="0" w:line="259" w:lineRule="auto"/>
+        <w:ind w:left="-15" w:right="-15"/>
+        <w:rPr>
+          <w:rFonts w:ascii="Times New Roman" w:eastAsia="Calibri" w:hAnsi="Times New Roman" w:cs="Times New Roman"/>
+          <w:sz w:val="20"/>
+        </w:rPr>
+      </w:pPr>
+      <w:r>
+        <w:rPr>
+          <w:rFonts w:ascii="Times New Roman" w:eastAsia="Calibri" w:hAnsi="Times New Roman" w:cs="Times New Roman"/>
+          <w:b/>
+          <w:sz w:val="20"/>
+        </w:rPr>
+        <w:t>Resident Advisor</w:t>
+      </w:r>
+      <w:r>
+        <w:rPr>
+          <w:rFonts w:ascii="Times New Roman" w:eastAsia="Calibri" w:hAnsi="Times New Roman" w:cs="Times New Roman"/>
+          <w:b/>
+          <w:sz w:val="20"/>
+        </w:rPr>
+        <w:tab/>
+      </w:r>
+      <w:r>
+        <w:rPr>
+          <w:rFonts w:ascii="Times New Roman" w:eastAsia="Calibri" w:hAnsi="Times New Roman" w:cs="Times New Roman"/>
+          <w:sz w:val="19"/>
+        </w:rPr>
+        <w:t>Jan 2026 - Present</w:t>
       </w:r>
     </w:p>
     <w:p>
       <w:pPr>
-        <w:pStyle w:val="ListParagraph"/>
-        <w:numPr>
-          <w:ilvl w:val="0"/>
-          <w:numId w:val="2"/>
-        </w:numPr>
-        <w:spacing w:after="0"/>
-        <w:rPr>
-          <w:rFonts w:ascii="Times New Roman" w:hAnsi="Times New Roman" w:cs="Times New Roman"/>
-        </w:rPr>
-      </w:pPr>
-      <w:r>
-        <w:rPr>
-          <w:rFonts w:ascii="Times New Roman" w:hAnsi="Times New Roman" w:cs="Times New Roman"/>
-        </w:rPr>
-        <w:t>Aided and guided individuals within the building offering support when needed</w:t>
+        <w:spacing w:after="52" w:line="259" w:lineRule="auto"/>
+        <w:ind w:left="-5" w:hanging="10"/>
+        <w:rPr>
+          <w:rFonts w:ascii="Times New Roman" w:eastAsia="Calibri" w:hAnsi="Times New Roman" w:cs="Times New Roman"/>
+          <w:sz w:val="20"/>
+        </w:rPr>
+      </w:pPr>
+      <w:r>
+        <w:rPr>
+          <w:rFonts w:ascii="Times New Roman" w:eastAsia="Calibri" w:hAnsi="Times New Roman" w:cs="Times New Roman"/>
+          <w:i/>
+          <w:sz w:val="19"/>
+        </w:rPr>
+        <w:t>University of Massachusetts Lowell | Lowell, Massachusetts</w:t>
       </w:r>
     </w:p>
     <w:p>
       <w:pPr>
-        <w:spacing w:after="0"/>
-        <w:rPr>
-          <w:rFonts w:ascii="Times New Roman" w:hAnsi="Times New Roman" w:cs="Times New Roman"/>
-        </w:rPr>
-      </w:pPr>
-      <w:r>
-        <w:rPr>
-          <w:rFonts w:ascii="Times New Roman" w:hAnsi="Times New Roman" w:cs="Times New Roman"/>
-        </w:rPr>
-        <w:t>University of Massachusetts Lowell, Lowell, Massachusetts</w:t>
-      </w:r>
-      <w:r>
-        <w:rPr>
-          <w:rFonts w:ascii="Times New Roman" w:hAnsi="Times New Roman" w:cs="Times New Roman"/>
-        </w:rPr>
-        <w:t xml:space="preserve"> </w:t>
-      </w:r>
-      <w:r>
-        <w:rPr>
-          <w:rFonts w:ascii="Times New Roman" w:hAnsi="Times New Roman" w:cs="Times New Roman"/>
-        </w:rPr>
-        <w:t xml:space="preserve">                                        </w:t>
-      </w:r>
-      <w:r>
-        <w:rPr>
-          <w:rFonts w:ascii="Times New Roman" w:hAnsi="Times New Roman" w:cs="Times New Roman"/>
-        </w:rPr>
-        <w:t xml:space="preserve">October 2023 </w:t>
-      </w:r>
-      <w:r>
-        <w:rPr>
-          <w:rFonts w:ascii="Times New Roman" w:hAnsi="Times New Roman" w:cs="Times New Roman"/>
-        </w:rPr>
-        <w:t>–</w:t>
-      </w:r>
-      <w:r>
-        <w:rPr>
-          <w:rFonts w:ascii="Times New Roman" w:hAnsi="Times New Roman" w:cs="Times New Roman"/>
-        </w:rPr>
-        <w:t xml:space="preserve"> </w:t>
-      </w:r>
-      <w:r>
-        <w:rPr>
-          <w:rFonts w:ascii="Times New Roman" w:hAnsi="Times New Roman" w:cs="Times New Roman"/>
-        </w:rPr>
-        <w:t>June 2026</w:t>
+        <w:spacing w:after="11" w:line="256" w:lineRule="auto"/>
+        <w:ind w:left="265" w:hanging="10"/>
+        <w:rPr>
+          <w:rFonts w:ascii="Times New Roman" w:eastAsia="Calibri" w:hAnsi="Times New Roman" w:cs="Times New Roman"/>
+          <w:sz w:val="20"/>
+        </w:rPr>
+      </w:pPr>
+      <w:r>
+        <w:rPr>
+          <w:rFonts w:ascii="Times New Roman" w:eastAsia="Calibri" w:hAnsi="Times New Roman" w:cs="Times New Roman"/>
+          <w:noProof/>
+          <w:sz w:val="22"/>
+        </w:rPr>
+        <mc:AlternateContent>
+          <mc:Choice Requires="wpg">
+            <w:drawing>
+              <wp:anchor distT="0" distB="0" distL="114300" distR="114300" simplePos="0" relativeHeight="251660288" behindDoc="0" locked="0" layoutInCell="1" allowOverlap="1" wp14:anchorId="044FE0D3" wp14:editId="0770B7D4">
+                <wp:simplePos x="0" y="0"/>
+                <wp:positionH relativeFrom="column">
+                  <wp:posOffset>23664</wp:posOffset>
+                </wp:positionH>
+                <wp:positionV relativeFrom="paragraph">
+                  <wp:posOffset>35287</wp:posOffset>
+                </wp:positionV>
+                <wp:extent cx="38100" cy="361950"/>
+                <wp:effectExtent l="0" t="0" r="0" b="0"/>
+                <wp:wrapSquare wrapText="bothSides"/>
+                <wp:docPr id="1010" name="Group 1010"/>
+                <wp:cNvGraphicFramePr/>
+                <a:graphic xmlns:a="http://schemas.openxmlformats.org/drawingml/2006/main">
+                  <a:graphicData uri="http://schemas.microsoft.com/office/word/2010/wordprocessingGroup">
+                    <wpg:wgp>
+                      <wpg:cNvGrpSpPr/>
+                      <wpg:grpSpPr>
+                        <a:xfrm>
+                          <a:off x="0" y="0"/>
+                          <a:ext cx="38100" cy="361950"/>
+                          <a:chOff x="0" y="0"/>
+                          <a:chExt cx="38100" cy="361950"/>
+                        </a:xfrm>
+                      </wpg:grpSpPr>
+                      <wps:wsp>
+                        <wps:cNvPr id="59" name="Shape 59"/>
+                        <wps:cNvSpPr/>
+                        <wps:spPr>
+                          <a:xfrm>
+                            <a:off x="0" y="0"/>
+                            <a:ext cx="38100" cy="38100"/>
+                          </a:xfrm>
+                          <a:custGeom>
+                            <a:avLst/>
+                            <a:gdLst/>
+                            <a:ahLst/>
+                            <a:cxnLst/>
+                            <a:rect l="0" t="0" r="0" b="0"/>
+                            <a:pathLst>
+                              <a:path w="38100" h="38100">
+                                <a:moveTo>
+                                  <a:pt x="19050" y="0"/>
+                                </a:moveTo>
+                                <a:cubicBezTo>
+                                  <a:pt x="21576" y="0"/>
+                                  <a:pt x="24006" y="484"/>
+                                  <a:pt x="26340" y="1450"/>
+                                </a:cubicBezTo>
+                                <a:cubicBezTo>
+                                  <a:pt x="28674" y="2416"/>
+                                  <a:pt x="30734" y="3793"/>
+                                  <a:pt x="32520" y="5579"/>
+                                </a:cubicBezTo>
+                                <a:cubicBezTo>
+                                  <a:pt x="34307" y="7365"/>
+                                  <a:pt x="35683" y="9425"/>
+                                  <a:pt x="36650" y="11759"/>
+                                </a:cubicBezTo>
+                                <a:cubicBezTo>
+                                  <a:pt x="37617" y="14093"/>
+                                  <a:pt x="38100" y="16523"/>
+                                  <a:pt x="38100" y="19050"/>
+                                </a:cubicBezTo>
+                                <a:cubicBezTo>
+                                  <a:pt x="38100" y="21576"/>
+                                  <a:pt x="37617" y="24006"/>
+                                  <a:pt x="36650" y="26340"/>
+                                </a:cubicBezTo>
+                                <a:cubicBezTo>
+                                  <a:pt x="35683" y="28673"/>
+                                  <a:pt x="34307" y="30734"/>
+                                  <a:pt x="32520" y="32520"/>
+                                </a:cubicBezTo>
+                                <a:cubicBezTo>
+                                  <a:pt x="30734" y="34306"/>
+                                  <a:pt x="28674" y="35682"/>
+                                  <a:pt x="26340" y="36649"/>
+                                </a:cubicBezTo>
+                                <a:cubicBezTo>
+                                  <a:pt x="24006" y="37616"/>
+                                  <a:pt x="21576" y="38100"/>
+                                  <a:pt x="19050" y="38100"/>
+                                </a:cubicBezTo>
+                                <a:cubicBezTo>
+                                  <a:pt x="16524" y="38100"/>
+                                  <a:pt x="14094" y="37616"/>
+                                  <a:pt x="11760" y="36649"/>
+                                </a:cubicBezTo>
+                                <a:cubicBezTo>
+                                  <a:pt x="9426" y="35682"/>
+                                  <a:pt x="7366" y="34306"/>
+                                  <a:pt x="5580" y="32520"/>
+                                </a:cubicBezTo>
+                                <a:cubicBezTo>
+                                  <a:pt x="3793" y="30734"/>
+                                  <a:pt x="2417" y="28673"/>
+                                  <a:pt x="1450" y="26340"/>
+                                </a:cubicBezTo>
+                                <a:cubicBezTo>
+                                  <a:pt x="483" y="24006"/>
+                                  <a:pt x="0" y="21576"/>
+                                  <a:pt x="0" y="19050"/>
+                                </a:cubicBezTo>
+                                <a:cubicBezTo>
+                                  <a:pt x="0" y="16523"/>
+                                  <a:pt x="483" y="14093"/>
+                                  <a:pt x="1450" y="11759"/>
+                                </a:cubicBezTo>
+                                <a:cubicBezTo>
+                                  <a:pt x="2417" y="9425"/>
+                                  <a:pt x="3793" y="7365"/>
+                                  <a:pt x="5580" y="5579"/>
+                                </a:cubicBezTo>
+                                <a:cubicBezTo>
+                                  <a:pt x="7366" y="3793"/>
+                                  <a:pt x="9426" y="2416"/>
+                                  <a:pt x="11760" y="1450"/>
+                                </a:cubicBezTo>
+                                <a:cubicBezTo>
+                                  <a:pt x="14094" y="484"/>
+                                  <a:pt x="16524" y="0"/>
+                                  <a:pt x="19050" y="0"/>
+                                </a:cubicBezTo>
+                                <a:close/>
+                              </a:path>
+                            </a:pathLst>
+                          </a:custGeom>
+                          <a:solidFill>
+                            <a:srgbClr val="172033"/>
+                          </a:solidFill>
+                          <a:ln w="0" cap="flat">
+                            <a:noFill/>
+                            <a:miter lim="127000"/>
+                          </a:ln>
+                          <a:effectLst/>
+                        </wps:spPr>
+                        <wps:bodyPr/>
+                      </wps:wsp>
+                      <wps:wsp>
+                        <wps:cNvPr id="62" name="Shape 62"/>
+                        <wps:cNvSpPr/>
+                        <wps:spPr>
+                          <a:xfrm>
+                            <a:off x="0" y="323850"/>
+                            <a:ext cx="38100" cy="38100"/>
+                          </a:xfrm>
+                          <a:custGeom>
+                            <a:avLst/>
+                            <a:gdLst/>
+                            <a:ahLst/>
+                            <a:cxnLst/>
+                            <a:rect l="0" t="0" r="0" b="0"/>
+                            <a:pathLst>
+                              <a:path w="38100" h="38100">
+                                <a:moveTo>
+                                  <a:pt x="19050" y="0"/>
+                                </a:moveTo>
+                                <a:cubicBezTo>
+                                  <a:pt x="21576" y="0"/>
+                                  <a:pt x="24006" y="484"/>
+                                  <a:pt x="26340" y="1450"/>
+                                </a:cubicBezTo>
+                                <a:cubicBezTo>
+                                  <a:pt x="28674" y="2416"/>
+                                  <a:pt x="30734" y="3793"/>
+                                  <a:pt x="32520" y="5580"/>
+                                </a:cubicBezTo>
+                                <a:cubicBezTo>
+                                  <a:pt x="34307" y="7365"/>
+                                  <a:pt x="35683" y="9425"/>
+                                  <a:pt x="36650" y="11760"/>
+                                </a:cubicBezTo>
+                                <a:cubicBezTo>
+                                  <a:pt x="37617" y="14094"/>
+                                  <a:pt x="38100" y="16524"/>
+                                  <a:pt x="38100" y="19050"/>
+                                </a:cubicBezTo>
+                                <a:cubicBezTo>
+                                  <a:pt x="38100" y="21576"/>
+                                  <a:pt x="37617" y="24006"/>
+                                  <a:pt x="36650" y="26339"/>
+                                </a:cubicBezTo>
+                                <a:cubicBezTo>
+                                  <a:pt x="35683" y="28673"/>
+                                  <a:pt x="34307" y="30733"/>
+                                  <a:pt x="32520" y="32520"/>
+                                </a:cubicBezTo>
+                                <a:cubicBezTo>
+                                  <a:pt x="30734" y="34306"/>
+                                  <a:pt x="28674" y="35682"/>
+                                  <a:pt x="26340" y="36649"/>
+                                </a:cubicBezTo>
+                                <a:cubicBezTo>
+                                  <a:pt x="24006" y="37616"/>
+                                  <a:pt x="21576" y="38100"/>
+                                  <a:pt x="19050" y="38100"/>
+                                </a:cubicBezTo>
+                                <a:cubicBezTo>
+                                  <a:pt x="16524" y="38100"/>
+                                  <a:pt x="14094" y="37616"/>
+                                  <a:pt x="11760" y="36649"/>
+                                </a:cubicBezTo>
+                                <a:cubicBezTo>
+                                  <a:pt x="9426" y="35682"/>
+                                  <a:pt x="7366" y="34306"/>
+                                  <a:pt x="5580" y="32520"/>
+                                </a:cubicBezTo>
+                                <a:cubicBezTo>
+                                  <a:pt x="3793" y="30733"/>
+                                  <a:pt x="2417" y="28673"/>
+                                  <a:pt x="1450" y="26339"/>
+                                </a:cubicBezTo>
+                                <a:cubicBezTo>
+                                  <a:pt x="483" y="24006"/>
+                                  <a:pt x="0" y="21576"/>
+                                  <a:pt x="0" y="19050"/>
+                                </a:cubicBezTo>
+                                <a:cubicBezTo>
+                                  <a:pt x="0" y="16524"/>
+                                  <a:pt x="483" y="14094"/>
+                                  <a:pt x="1450" y="11760"/>
+                                </a:cubicBezTo>
+                                <a:cubicBezTo>
+                                  <a:pt x="2417" y="9425"/>
+                                  <a:pt x="3793" y="7365"/>
+                                  <a:pt x="5580" y="5580"/>
+                                </a:cubicBezTo>
+                                <a:cubicBezTo>
+                                  <a:pt x="7366" y="3793"/>
+                                  <a:pt x="9426" y="2416"/>
+                                  <a:pt x="11760" y="1450"/>
+                                </a:cubicBezTo>
+                                <a:cubicBezTo>
+                                  <a:pt x="14094" y="484"/>
+                                  <a:pt x="16524" y="0"/>
+                                  <a:pt x="19050" y="0"/>
+                                </a:cubicBezTo>
+                                <a:close/>
+                              </a:path>
+                            </a:pathLst>
+                          </a:custGeom>
+                          <a:solidFill>
+                            <a:srgbClr val="172033"/>
+                          </a:solidFill>
+                          <a:ln w="0" cap="flat">
+                            <a:noFill/>
+                            <a:miter lim="127000"/>
+                          </a:ln>
+                          <a:effectLst/>
+                        </wps:spPr>
+                        <wps:bodyPr/>
+                      </wps:wsp>
+                    </wpg:wgp>
+                  </a:graphicData>
+                </a:graphic>
+              </wp:anchor>
+            </w:drawing>
+          </mc:Choice>
+          <mc:Fallback>
+            <w:pict>
+              <v:group w14:anchorId="24CFDC1C" id="Group 1010" o:spid="_x0000_s1026" style="position:absolute;margin-left:1.85pt;margin-top:2.8pt;width:3pt;height:28.5pt;z-index:251660288" coordsize="38100,361950" o:gfxdata="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">
+                <v:shape id="Shape 59" o:spid="_x0000_s1027" style="position:absolute;width:38100;height:38100;visibility:visible;mso-wrap-style:square;v-text-anchor:top" coordsize="38100,38100" o:gfxdata="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" path="m19050,v2526,,4956,484,7290,1450c28674,2416,30734,3793,32520,5579v1787,1786,3163,3846,4130,6180c37617,14093,38100,16523,38100,19050v,2526,-483,4956,-1450,7290c35683,28673,34307,30734,32520,32520v-1786,1786,-3846,3162,-6180,4129c24006,37616,21576,38100,19050,38100v-2526,,-4956,-484,-7290,-1451c9426,35682,7366,34306,5580,32520,3793,30734,2417,28673,1450,26340,483,24006,,21576,,19050,,16523,483,14093,1450,11759,2417,9425,3793,7365,5580,5579,7366,3793,9426,2416,11760,1450,14094,484,16524,,19050,xe" fillcolor="#172033" stroked="f" strokeweight="0">
+                  <v:stroke miterlimit="83231f" joinstyle="miter"/>
+                  <v:path arrowok="t" textboxrect="0,0,38100,38100"/>
+                </v:shape>
+                <v:shape id="Shape 62" o:spid="_x0000_s1028" style="position:absolute;top:323850;width:38100;height:38100;visibility:visible;mso-wrap-style:square;v-text-anchor:top" coordsize="38100,38100" o:gfxdata="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" path="m19050,v2526,,4956,484,7290,1450c28674,2416,30734,3793,32520,5580v1787,1785,3163,3845,4130,6180c37617,14094,38100,16524,38100,19050v,2526,-483,4956,-1450,7289c35683,28673,34307,30733,32520,32520v-1786,1786,-3846,3162,-6180,4129c24006,37616,21576,38100,19050,38100v-2526,,-4956,-484,-7290,-1451c9426,35682,7366,34306,5580,32520,3793,30733,2417,28673,1450,26339,483,24006,,21576,,19050,,16524,483,14094,1450,11760,2417,9425,3793,7365,5580,5580,7366,3793,9426,2416,11760,1450,14094,484,16524,,19050,xe" fillcolor="#172033" stroked="f" strokeweight="0">
+                  <v:stroke miterlimit="83231f" joinstyle="miter"/>
+                  <v:path arrowok="t" textboxrect="0,0,38100,38100"/>
+                </v:shape>
+                <w10:wrap type="square"/>
+              </v:group>
+            </w:pict>
+          </mc:Fallback>
+        </mc:AlternateContent>
+      </w:r>
+      <w:r>
+        <w:rPr>
+          <w:rFonts w:ascii="Times New Roman" w:eastAsia="Calibri" w:hAnsi="Times New Roman" w:cs="Times New Roman"/>
+          <w:sz w:val="20"/>
+        </w:rPr>
+        <w:t>Respond to resident concerns, document incidents, and coordinate with university staff to resolve sensitive or unexpected situations.</w:t>
       </w:r>
     </w:p>
     <w:p>
       <w:pPr>
-        <w:spacing w:after="0"/>
-        <w:rPr>
-          <w:rFonts w:ascii="Times New Roman" w:hAnsi="Times New Roman" w:cs="Times New Roman"/>
-        </w:rPr>
-      </w:pPr>
-      <w:r>
-        <w:rPr>
-          <w:rFonts w:ascii="Times New Roman" w:hAnsi="Times New Roman" w:cs="Times New Roman"/>
-        </w:rPr>
-        <w:t>Digital Navigator</w:t>
-      </w:r>
-      <w:r>
-        <w:rPr>
-          <w:rFonts w:ascii="Times New Roman" w:hAnsi="Times New Roman" w:cs="Times New Roman"/>
-        </w:rPr>
-        <w:t xml:space="preserve"> Volunteer</w:t>
+        <w:spacing w:after="92" w:line="256" w:lineRule="auto"/>
+        <w:ind w:left="265" w:hanging="10"/>
+        <w:rPr>
+          <w:rFonts w:ascii="Times New Roman" w:eastAsia="Calibri" w:hAnsi="Times New Roman" w:cs="Times New Roman"/>
+          <w:sz w:val="20"/>
+        </w:rPr>
+      </w:pPr>
+      <w:r>
+        <w:rPr>
+          <w:rFonts w:ascii="Times New Roman" w:eastAsia="Calibri" w:hAnsi="Times New Roman" w:cs="Times New Roman"/>
+          <w:sz w:val="20"/>
+        </w:rPr>
+        <w:t>Communicate policies clearly, mentor residents, and help maintain a safe and inclusive residential environment.</w:t>
       </w:r>
     </w:p>
     <w:p>
       <w:pPr>
-        <w:pStyle w:val="ListParagraph"/>
-        <w:numPr>
-          <w:ilvl w:val="0"/>
-          <w:numId w:val="1"/>
-        </w:numPr>
-        <w:spacing w:after="0"/>
-        <w:rPr>
-          <w:rFonts w:ascii="Times New Roman" w:hAnsi="Times New Roman" w:cs="Times New Roman"/>
-        </w:rPr>
-      </w:pPr>
-      <w:r>
-        <w:rPr>
-          <w:rFonts w:ascii="Times New Roman" w:hAnsi="Times New Roman" w:cs="Times New Roman"/>
-        </w:rPr>
-        <w:t>I taught underprivileged people in the community how to us</w:t>
-      </w:r>
-      <w:r>
-        <w:rPr>
-          <w:rFonts w:ascii="Times New Roman" w:hAnsi="Times New Roman" w:cs="Times New Roman"/>
-        </w:rPr>
-        <w:t xml:space="preserve">e a </w:t>
-      </w:r>
-      <w:proofErr w:type="gramStart"/>
-      <w:r>
-        <w:rPr>
-          <w:rFonts w:ascii="Times New Roman" w:hAnsi="Times New Roman" w:cs="Times New Roman"/>
-        </w:rPr>
-        <w:t>laptop/other electronic device</w:t>
-      </w:r>
-      <w:r>
-        <w:rPr>
-          <w:rFonts w:ascii="Times New Roman" w:hAnsi="Times New Roman" w:cs="Times New Roman"/>
-        </w:rPr>
-        <w:t>s</w:t>
-      </w:r>
-      <w:proofErr w:type="gramEnd"/>
-      <w:r>
-        <w:rPr>
-          <w:rFonts w:ascii="Times New Roman" w:hAnsi="Times New Roman" w:cs="Times New Roman"/>
-        </w:rPr>
-        <w:t xml:space="preserve"> through a </w:t>
-      </w:r>
-      <w:r>
-        <w:rPr>
-          <w:rFonts w:ascii="Times New Roman" w:hAnsi="Times New Roman" w:cs="Times New Roman"/>
-        </w:rPr>
-        <w:t>grant</w:t>
-      </w:r>
-      <w:r>
-        <w:rPr>
-          <w:rFonts w:ascii="Times New Roman" w:hAnsi="Times New Roman" w:cs="Times New Roman"/>
-        </w:rPr>
-        <w:t xml:space="preserve">. </w:t>
+        <w:tabs>
+          <w:tab w:val="right" w:pos="10455"/>
+        </w:tabs>
+        <w:spacing w:after="0" w:line="259" w:lineRule="auto"/>
+        <w:ind w:left="-15" w:right="-15"/>
+        <w:rPr>
+          <w:rFonts w:ascii="Times New Roman" w:eastAsia="Calibri" w:hAnsi="Times New Roman" w:cs="Times New Roman"/>
+          <w:sz w:val="20"/>
+        </w:rPr>
+      </w:pPr>
+      <w:r>
+        <w:rPr>
+          <w:rFonts w:ascii="Times New Roman" w:eastAsia="Calibri" w:hAnsi="Times New Roman" w:cs="Times New Roman"/>
+          <w:b/>
+          <w:sz w:val="20"/>
+        </w:rPr>
+        <w:t>Building Manager</w:t>
+      </w:r>
+      <w:r>
+        <w:rPr>
+          <w:rFonts w:ascii="Times New Roman" w:eastAsia="Calibri" w:hAnsi="Times New Roman" w:cs="Times New Roman"/>
+          <w:b/>
+          <w:sz w:val="20"/>
+        </w:rPr>
+        <w:tab/>
+      </w:r>
+      <w:r>
+        <w:rPr>
+          <w:rFonts w:ascii="Times New Roman" w:eastAsia="Calibri" w:hAnsi="Times New Roman" w:cs="Times New Roman"/>
+          <w:sz w:val="19"/>
+        </w:rPr>
+        <w:t>Jun 2023 - Present</w:t>
       </w:r>
     </w:p>
     <w:p>
       <w:pPr>
-        <w:pStyle w:val="ListParagraph"/>
-        <w:numPr>
-          <w:ilvl w:val="0"/>
-          <w:numId w:val="1"/>
-        </w:numPr>
-        <w:spacing w:after="0"/>
-        <w:rPr>
-          <w:rFonts w:ascii="Times New Roman" w:hAnsi="Times New Roman" w:cs="Times New Roman"/>
-        </w:rPr>
-      </w:pPr>
-      <w:r>
-        <w:rPr>
-          <w:rFonts w:ascii="Times New Roman" w:hAnsi="Times New Roman" w:cs="Times New Roman"/>
-        </w:rPr>
-        <w:t xml:space="preserve">We created a </w:t>
-      </w:r>
-      <w:r>
-        <w:rPr>
-          <w:rFonts w:ascii="Times New Roman" w:hAnsi="Times New Roman" w:cs="Times New Roman"/>
-        </w:rPr>
-        <w:t>PowerPoint</w:t>
-      </w:r>
-      <w:r>
-        <w:rPr>
-          <w:rFonts w:ascii="Times New Roman" w:hAnsi="Times New Roman" w:cs="Times New Roman"/>
-        </w:rPr>
-        <w:t xml:space="preserve"> presentation based on the module learning materials given to us</w:t>
-      </w:r>
-      <w:r>
-        <w:rPr>
-          <w:rFonts w:ascii="Times New Roman" w:hAnsi="Times New Roman" w:cs="Times New Roman"/>
-        </w:rPr>
-        <w:t>.</w:t>
+        <w:spacing w:after="52" w:line="259" w:lineRule="auto"/>
+        <w:ind w:left="-5" w:hanging="10"/>
+        <w:rPr>
+          <w:rFonts w:ascii="Times New Roman" w:eastAsia="Calibri" w:hAnsi="Times New Roman" w:cs="Times New Roman"/>
+          <w:sz w:val="20"/>
+        </w:rPr>
+      </w:pPr>
+      <w:r>
+        <w:rPr>
+          <w:rFonts w:ascii="Times New Roman" w:eastAsia="Calibri" w:hAnsi="Times New Roman" w:cs="Times New Roman"/>
+          <w:i/>
+          <w:sz w:val="19"/>
+        </w:rPr>
+        <w:t>University of Massachusetts Lowell | Lowell, Massachusetts</w:t>
       </w:r>
     </w:p>
     <w:p>
       <w:pPr>
-        <w:pStyle w:val="ListParagraph"/>
-        <w:numPr>
-          <w:ilvl w:val="0"/>
-          <w:numId w:val="1"/>
-        </w:numPr>
-        <w:spacing w:after="0"/>
-        <w:rPr>
-          <w:rFonts w:ascii="Times New Roman" w:hAnsi="Times New Roman" w:cs="Times New Roman"/>
-        </w:rPr>
-      </w:pPr>
-      <w:r>
-        <w:rPr>
-          <w:rFonts w:ascii="Times New Roman" w:hAnsi="Times New Roman" w:cs="Times New Roman"/>
-        </w:rPr>
-        <w:t>Educated and guided users in navigating Microsoft software applications, enhancing their proficiency.</w:t>
+        <w:spacing w:after="11" w:line="256" w:lineRule="auto"/>
+        <w:ind w:left="265" w:hanging="10"/>
+        <w:rPr>
+          <w:rFonts w:ascii="Times New Roman" w:eastAsia="Calibri" w:hAnsi="Times New Roman" w:cs="Times New Roman"/>
+          <w:sz w:val="20"/>
+        </w:rPr>
+      </w:pPr>
+      <w:r>
+        <w:rPr>
+          <w:rFonts w:ascii="Times New Roman" w:eastAsia="Calibri" w:hAnsi="Times New Roman" w:cs="Times New Roman"/>
+          <w:noProof/>
+          <w:sz w:val="22"/>
+        </w:rPr>
+        <mc:AlternateContent>
+          <mc:Choice Requires="wpg">
+            <w:drawing>
+              <wp:anchor distT="0" distB="0" distL="114300" distR="114300" simplePos="0" relativeHeight="251661312" behindDoc="0" locked="0" layoutInCell="1" allowOverlap="1" wp14:anchorId="0A48E3D6" wp14:editId="2959357A">
+                <wp:simplePos x="0" y="0"/>
+                <wp:positionH relativeFrom="column">
+                  <wp:posOffset>23664</wp:posOffset>
+                </wp:positionH>
+                <wp:positionV relativeFrom="paragraph">
+                  <wp:posOffset>35287</wp:posOffset>
+                </wp:positionV>
+                <wp:extent cx="38100" cy="371475"/>
+                <wp:effectExtent l="0" t="0" r="0" b="0"/>
+                <wp:wrapSquare wrapText="bothSides"/>
+                <wp:docPr id="1011" name="Group 1011"/>
+                <wp:cNvGraphicFramePr/>
+                <a:graphic xmlns:a="http://schemas.openxmlformats.org/drawingml/2006/main">
+                  <a:graphicData uri="http://schemas.microsoft.com/office/word/2010/wordprocessingGroup">
+                    <wpg:wgp>
+                      <wpg:cNvGrpSpPr/>
+                      <wpg:grpSpPr>
+                        <a:xfrm>
+                          <a:off x="0" y="0"/>
+                          <a:ext cx="38100" cy="371475"/>
+                          <a:chOff x="0" y="0"/>
+                          <a:chExt cx="38100" cy="371475"/>
+                        </a:xfrm>
+                      </wpg:grpSpPr>
+                      <wps:wsp>
+                        <wps:cNvPr id="67" name="Shape 67"/>
+                        <wps:cNvSpPr/>
+                        <wps:spPr>
+                          <a:xfrm>
+                            <a:off x="0" y="0"/>
+                            <a:ext cx="38100" cy="38100"/>
+                          </a:xfrm>
+                          <a:custGeom>
+                            <a:avLst/>
+                            <a:gdLst/>
+                            <a:ahLst/>
+                            <a:cxnLst/>
+                            <a:rect l="0" t="0" r="0" b="0"/>
+                            <a:pathLst>
+                              <a:path w="38100" h="38100">
+                                <a:moveTo>
+                                  <a:pt x="19050" y="0"/>
+                                </a:moveTo>
+                                <a:cubicBezTo>
+                                  <a:pt x="21576" y="0"/>
+                                  <a:pt x="24006" y="483"/>
+                                  <a:pt x="26340" y="1450"/>
+                                </a:cubicBezTo>
+                                <a:cubicBezTo>
+                                  <a:pt x="28674" y="2416"/>
+                                  <a:pt x="30734" y="3792"/>
+                                  <a:pt x="32520" y="5579"/>
+                                </a:cubicBezTo>
+                                <a:cubicBezTo>
+                                  <a:pt x="34307" y="7365"/>
+                                  <a:pt x="35683" y="9425"/>
+                                  <a:pt x="36650" y="11759"/>
+                                </a:cubicBezTo>
+                                <a:cubicBezTo>
+                                  <a:pt x="37617" y="14093"/>
+                                  <a:pt x="38100" y="16523"/>
+                                  <a:pt x="38100" y="19050"/>
+                                </a:cubicBezTo>
+                                <a:cubicBezTo>
+                                  <a:pt x="38100" y="21575"/>
+                                  <a:pt x="37617" y="24005"/>
+                                  <a:pt x="36650" y="26339"/>
+                                </a:cubicBezTo>
+                                <a:cubicBezTo>
+                                  <a:pt x="35683" y="28673"/>
+                                  <a:pt x="34307" y="30733"/>
+                                  <a:pt x="32520" y="32520"/>
+                                </a:cubicBezTo>
+                                <a:cubicBezTo>
+                                  <a:pt x="30734" y="34305"/>
+                                  <a:pt x="28674" y="35682"/>
+                                  <a:pt x="26340" y="36648"/>
+                                </a:cubicBezTo>
+                                <a:cubicBezTo>
+                                  <a:pt x="24006" y="37616"/>
+                                  <a:pt x="21576" y="38099"/>
+                                  <a:pt x="19050" y="38100"/>
+                                </a:cubicBezTo>
+                                <a:cubicBezTo>
+                                  <a:pt x="16524" y="38099"/>
+                                  <a:pt x="14094" y="37615"/>
+                                  <a:pt x="11760" y="36648"/>
+                                </a:cubicBezTo>
+                                <a:cubicBezTo>
+                                  <a:pt x="9426" y="35681"/>
+                                  <a:pt x="7366" y="34305"/>
+                                  <a:pt x="5580" y="32520"/>
+                                </a:cubicBezTo>
+                                <a:cubicBezTo>
+                                  <a:pt x="3793" y="30733"/>
+                                  <a:pt x="2417" y="28673"/>
+                                  <a:pt x="1450" y="26339"/>
+                                </a:cubicBezTo>
+                                <a:cubicBezTo>
+                                  <a:pt x="483" y="24005"/>
+                                  <a:pt x="0" y="21575"/>
+                                  <a:pt x="0" y="19050"/>
+                                </a:cubicBezTo>
+                                <a:cubicBezTo>
+                                  <a:pt x="0" y="16523"/>
+                                  <a:pt x="483" y="14093"/>
+                                  <a:pt x="1450" y="11759"/>
+                                </a:cubicBezTo>
+                                <a:cubicBezTo>
+                                  <a:pt x="2417" y="9424"/>
+                                  <a:pt x="3793" y="7365"/>
+                                  <a:pt x="5580" y="5579"/>
+                                </a:cubicBezTo>
+                                <a:cubicBezTo>
+                                  <a:pt x="7366" y="3792"/>
+                                  <a:pt x="9426" y="2416"/>
+                                  <a:pt x="11760" y="1450"/>
+                                </a:cubicBezTo>
+                                <a:cubicBezTo>
+                                  <a:pt x="14094" y="483"/>
+                                  <a:pt x="16524" y="0"/>
+                                  <a:pt x="19050" y="0"/>
+                                </a:cubicBezTo>
+                                <a:close/>
+                              </a:path>
+                            </a:pathLst>
+                          </a:custGeom>
+                          <a:solidFill>
+                            <a:srgbClr val="172033"/>
+                          </a:solidFill>
+                          <a:ln w="0" cap="flat">
+                            <a:noFill/>
+                            <a:miter lim="127000"/>
+                          </a:ln>
+                          <a:effectLst/>
+                        </wps:spPr>
+                        <wps:bodyPr/>
+                      </wps:wsp>
+                      <wps:wsp>
+                        <wps:cNvPr id="70" name="Shape 70"/>
+                        <wps:cNvSpPr/>
+                        <wps:spPr>
+                          <a:xfrm>
+                            <a:off x="0" y="333375"/>
+                            <a:ext cx="38100" cy="38100"/>
+                          </a:xfrm>
+                          <a:custGeom>
+                            <a:avLst/>
+                            <a:gdLst/>
+                            <a:ahLst/>
+                            <a:cxnLst/>
+                            <a:rect l="0" t="0" r="0" b="0"/>
+                            <a:pathLst>
+                              <a:path w="38100" h="38100">
+                                <a:moveTo>
+                                  <a:pt x="19050" y="0"/>
+                                </a:moveTo>
+                                <a:cubicBezTo>
+                                  <a:pt x="21576" y="0"/>
+                                  <a:pt x="24006" y="483"/>
+                                  <a:pt x="26340" y="1449"/>
+                                </a:cubicBezTo>
+                                <a:cubicBezTo>
+                                  <a:pt x="28674" y="2415"/>
+                                  <a:pt x="30734" y="3793"/>
+                                  <a:pt x="32520" y="5580"/>
+                                </a:cubicBezTo>
+                                <a:cubicBezTo>
+                                  <a:pt x="34307" y="7365"/>
+                                  <a:pt x="35683" y="9425"/>
+                                  <a:pt x="36650" y="11759"/>
+                                </a:cubicBezTo>
+                                <a:cubicBezTo>
+                                  <a:pt x="37617" y="14093"/>
+                                  <a:pt x="38100" y="16523"/>
+                                  <a:pt x="38100" y="19050"/>
+                                </a:cubicBezTo>
+                                <a:cubicBezTo>
+                                  <a:pt x="38100" y="21576"/>
+                                  <a:pt x="37617" y="24006"/>
+                                  <a:pt x="36650" y="26339"/>
+                                </a:cubicBezTo>
+                                <a:cubicBezTo>
+                                  <a:pt x="35683" y="28673"/>
+                                  <a:pt x="34307" y="30733"/>
+                                  <a:pt x="32520" y="32520"/>
+                                </a:cubicBezTo>
+                                <a:cubicBezTo>
+                                  <a:pt x="30734" y="34306"/>
+                                  <a:pt x="28674" y="35682"/>
+                                  <a:pt x="26340" y="36649"/>
+                                </a:cubicBezTo>
+                                <a:cubicBezTo>
+                                  <a:pt x="24006" y="37616"/>
+                                  <a:pt x="21576" y="38099"/>
+                                  <a:pt x="19050" y="38100"/>
+                                </a:cubicBezTo>
+                                <a:cubicBezTo>
+                                  <a:pt x="16524" y="38099"/>
+                                  <a:pt x="14094" y="37616"/>
+                                  <a:pt x="11760" y="36649"/>
+                                </a:cubicBezTo>
+                                <a:cubicBezTo>
+                                  <a:pt x="9426" y="35682"/>
+                                  <a:pt x="7366" y="34306"/>
+                                  <a:pt x="5580" y="32520"/>
+                                </a:cubicBezTo>
+                                <a:cubicBezTo>
+                                  <a:pt x="3793" y="30733"/>
+                                  <a:pt x="2417" y="28673"/>
+                                  <a:pt x="1450" y="26339"/>
+                                </a:cubicBezTo>
+                                <a:cubicBezTo>
+                                  <a:pt x="483" y="24006"/>
+                                  <a:pt x="0" y="21576"/>
+                                  <a:pt x="0" y="19050"/>
+                                </a:cubicBezTo>
+                                <a:cubicBezTo>
+                                  <a:pt x="0" y="16523"/>
+                                  <a:pt x="483" y="14093"/>
+                                  <a:pt x="1450" y="11759"/>
+                                </a:cubicBezTo>
+                                <a:cubicBezTo>
+                                  <a:pt x="2417" y="9425"/>
+                                  <a:pt x="3793" y="7365"/>
+                                  <a:pt x="5580" y="5580"/>
+                                </a:cubicBezTo>
+                                <a:cubicBezTo>
+                                  <a:pt x="7366" y="3793"/>
+                                  <a:pt x="9426" y="2416"/>
+                                  <a:pt x="11760" y="1450"/>
+                                </a:cubicBezTo>
+                                <a:cubicBezTo>
+                                  <a:pt x="14094" y="483"/>
+                                  <a:pt x="16524" y="0"/>
+                                  <a:pt x="19050" y="0"/>
+                                </a:cubicBezTo>
+                                <a:close/>
+                              </a:path>
+                            </a:pathLst>
+                          </a:custGeom>
+                          <a:solidFill>
+                            <a:srgbClr val="172033"/>
+                          </a:solidFill>
+                          <a:ln w="0" cap="flat">
+                            <a:noFill/>
+                            <a:miter lim="127000"/>
+                          </a:ln>
+                          <a:effectLst/>
+                        </wps:spPr>
+                        <wps:bodyPr/>
+                      </wps:wsp>
+                    </wpg:wgp>
+                  </a:graphicData>
+                </a:graphic>
+              </wp:anchor>
+            </w:drawing>
+          </mc:Choice>
+          <mc:Fallback>
+            <w:pict>
+              <v:group w14:anchorId="1EBF3A1C" id="Group 1011" o:spid="_x0000_s1026" style="position:absolute;margin-left:1.85pt;margin-top:2.8pt;width:3pt;height:29.25pt;z-index:251661312" coordsize="38100,371475" o:gfxdata="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">
+                <v:shape id="Shape 67" o:spid="_x0000_s1027" style="position:absolute;width:38100;height:38100;visibility:visible;mso-wrap-style:square;v-text-anchor:top" coordsize="38100,38100" o:gfxdata="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" path="m19050,v2526,,4956,483,7290,1450c28674,2416,30734,3792,32520,5579v1787,1786,3163,3846,4130,6180c37617,14093,38100,16523,38100,19050v,2525,-483,4955,-1450,7289c35683,28673,34307,30733,32520,32520v-1786,1785,-3846,3162,-6180,4128c24006,37616,21576,38099,19050,38100v-2526,-1,-4956,-485,-7290,-1452c9426,35681,7366,34305,5580,32520,3793,30733,2417,28673,1450,26339,483,24005,,21575,,19050,,16523,483,14093,1450,11759,2417,9424,3793,7365,5580,5579,7366,3792,9426,2416,11760,1450,14094,483,16524,,19050,xe" fillcolor="#172033" stroked="f" strokeweight="0">
+                  <v:stroke miterlimit="83231f" joinstyle="miter"/>
+                  <v:path arrowok="t" textboxrect="0,0,38100,38100"/>
+                </v:shape>
+                <v:shape id="Shape 70" o:spid="_x0000_s1028" style="position:absolute;top:333375;width:38100;height:38100;visibility:visible;mso-wrap-style:square;v-text-anchor:top" coordsize="38100,38100" o:gfxdata="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" path="m19050,v2526,,4956,483,7290,1449c28674,2415,30734,3793,32520,5580v1787,1785,3163,3845,4130,6179c37617,14093,38100,16523,38100,19050v,2526,-483,4956,-1450,7289c35683,28673,34307,30733,32520,32520v-1786,1786,-3846,3162,-6180,4129c24006,37616,21576,38099,19050,38100v-2526,-1,-4956,-484,-7290,-1451c9426,35682,7366,34306,5580,32520,3793,30733,2417,28673,1450,26339,483,24006,,21576,,19050,,16523,483,14093,1450,11759,2417,9425,3793,7365,5580,5580,7366,3793,9426,2416,11760,1450,14094,483,16524,,19050,xe" fillcolor="#172033" stroked="f" strokeweight="0">
+                  <v:stroke miterlimit="83231f" joinstyle="miter"/>
+                  <v:path arrowok="t" textboxrect="0,0,38100,38100"/>
+                </v:shape>
+                <w10:wrap type="square"/>
+              </v:group>
+            </w:pict>
+          </mc:Fallback>
+        </mc:AlternateContent>
+      </w:r>
+      <w:r>
+        <w:rPr>
+          <w:rFonts w:ascii="Times New Roman" w:eastAsia="Calibri" w:hAnsi="Times New Roman" w:cs="Times New Roman"/>
+          <w:sz w:val="20"/>
+        </w:rPr>
+        <w:t>Coordinate conference-room events with clients and campus teams, supporting reliable execution in a fast-paced environment.</w:t>
       </w:r>
     </w:p>
     <w:p>
       <w:pPr>
-        <w:pStyle w:val="ListParagraph"/>
-        <w:numPr>
-          <w:ilvl w:val="0"/>
-          <w:numId w:val="1"/>
-        </w:numPr>
-        <w:spacing w:after="0"/>
-        <w:rPr>
-          <w:rFonts w:ascii="Times New Roman" w:hAnsi="Times New Roman" w:cs="Times New Roman"/>
-        </w:rPr>
-      </w:pPr>
-      <w:r>
-        <w:rPr>
-          <w:rFonts w:ascii="Times New Roman" w:hAnsi="Times New Roman" w:cs="Times New Roman"/>
-        </w:rPr>
-        <w:t>Collaborated with team members to achieve class objectives and ensure task completion.</w:t>
+        <w:spacing w:after="93" w:line="256" w:lineRule="auto"/>
+        <w:ind w:left="265" w:hanging="10"/>
+        <w:rPr>
+          <w:rFonts w:ascii="Times New Roman" w:eastAsia="Calibri" w:hAnsi="Times New Roman" w:cs="Times New Roman"/>
+          <w:sz w:val="20"/>
+        </w:rPr>
+      </w:pPr>
+      <w:r>
+        <w:rPr>
+          <w:rFonts w:ascii="Times New Roman" w:eastAsia="Calibri" w:hAnsi="Times New Roman" w:cs="Times New Roman"/>
+          <w:sz w:val="20"/>
+        </w:rPr>
+        <w:t xml:space="preserve">Conduct building rounds, identify operational issues, and </w:t>
+      </w:r>
+      <w:proofErr w:type="gramStart"/>
+      <w:r>
+        <w:rPr>
+          <w:rFonts w:ascii="Times New Roman" w:eastAsia="Calibri" w:hAnsi="Times New Roman" w:cs="Times New Roman"/>
+          <w:sz w:val="20"/>
+        </w:rPr>
+        <w:t>take action</w:t>
+      </w:r>
+      <w:proofErr w:type="gramEnd"/>
+      <w:r>
+        <w:rPr>
+          <w:rFonts w:ascii="Times New Roman" w:eastAsia="Calibri" w:hAnsi="Times New Roman" w:cs="Times New Roman"/>
+          <w:sz w:val="20"/>
+        </w:rPr>
+        <w:t xml:space="preserve"> or escalate concerns to maintain facility standards.</w:t>
       </w:r>
     </w:p>
     <w:p>
       <w:pPr>
-        <w:pStyle w:val="ListParagraph"/>
-        <w:numPr>
-          <w:ilvl w:val="0"/>
-          <w:numId w:val="1"/>
-        </w:numPr>
-        <w:spacing w:after="0"/>
-        <w:rPr>
-          <w:rFonts w:ascii="Times New Roman" w:hAnsi="Times New Roman" w:cs="Times New Roman"/>
-        </w:rPr>
-      </w:pPr>
-      <w:r>
-        <w:rPr>
-          <w:rFonts w:ascii="Times New Roman" w:hAnsi="Times New Roman" w:cs="Times New Roman"/>
-        </w:rPr>
-        <w:lastRenderedPageBreak/>
-        <w:t>Dedicated to delivering superior customer service within a dynamic, fast-paced setting.</w:t>
+        <w:tabs>
+          <w:tab w:val="right" w:pos="10455"/>
+        </w:tabs>
+        <w:spacing w:after="0" w:line="259" w:lineRule="auto"/>
+        <w:ind w:left="-15" w:right="-15"/>
+        <w:rPr>
+          <w:rFonts w:ascii="Times New Roman" w:eastAsia="Calibri" w:hAnsi="Times New Roman" w:cs="Times New Roman"/>
+          <w:sz w:val="20"/>
+        </w:rPr>
+      </w:pPr>
+      <w:r>
+        <w:rPr>
+          <w:rFonts w:ascii="Times New Roman" w:eastAsia="Calibri" w:hAnsi="Times New Roman" w:cs="Times New Roman"/>
+          <w:b/>
+          <w:sz w:val="20"/>
+        </w:rPr>
+        <w:t>Digital Navigator Volunteer</w:t>
+      </w:r>
+      <w:r>
+        <w:rPr>
+          <w:rFonts w:ascii="Times New Roman" w:eastAsia="Calibri" w:hAnsi="Times New Roman" w:cs="Times New Roman"/>
+          <w:b/>
+          <w:sz w:val="20"/>
+        </w:rPr>
+        <w:tab/>
+      </w:r>
+      <w:r>
+        <w:rPr>
+          <w:rFonts w:ascii="Times New Roman" w:eastAsia="Calibri" w:hAnsi="Times New Roman" w:cs="Times New Roman"/>
+          <w:sz w:val="19"/>
+        </w:rPr>
+        <w:t>Oct 2023 - Aug 2026</w:t>
       </w:r>
     </w:p>
     <w:p>
       <w:pPr>
-        <w:spacing w:after="0"/>
-        <w:rPr>
-          <w:rFonts w:ascii="Times New Roman" w:hAnsi="Times New Roman" w:cs="Times New Roman"/>
-        </w:rPr>
-      </w:pPr>
-      <w:r>
-        <w:rPr>
-          <w:rFonts w:ascii="Times New Roman" w:hAnsi="Times New Roman" w:cs="Times New Roman"/>
-        </w:rPr>
-        <w:t>University of Massachusetts Lowell, Lowell, Massachusetts</w:t>
-      </w:r>
-      <w:r>
-        <w:rPr>
-          <w:rFonts w:ascii="Times New Roman" w:hAnsi="Times New Roman" w:cs="Times New Roman"/>
-        </w:rPr>
-        <w:t xml:space="preserve"> </w:t>
-      </w:r>
-      <w:r>
-        <w:rPr>
-          <w:rFonts w:ascii="Times New Roman" w:hAnsi="Times New Roman" w:cs="Times New Roman"/>
-        </w:rPr>
-        <w:t xml:space="preserve">                                              </w:t>
-      </w:r>
-      <w:r>
-        <w:rPr>
-          <w:rFonts w:ascii="Times New Roman" w:hAnsi="Times New Roman" w:cs="Times New Roman"/>
-        </w:rPr>
-        <w:t xml:space="preserve">January 2026 - </w:t>
-      </w:r>
-      <w:r>
-        <w:rPr>
-          <w:rFonts w:ascii="Times New Roman" w:hAnsi="Times New Roman" w:cs="Times New Roman"/>
-        </w:rPr>
-        <w:t>Present</w:t>
+        <w:spacing w:after="52" w:line="259" w:lineRule="auto"/>
+        <w:ind w:left="-5" w:hanging="10"/>
+        <w:rPr>
+          <w:rFonts w:ascii="Times New Roman" w:eastAsia="Calibri" w:hAnsi="Times New Roman" w:cs="Times New Roman"/>
+          <w:sz w:val="20"/>
+        </w:rPr>
+      </w:pPr>
+      <w:r>
+        <w:rPr>
+          <w:rFonts w:ascii="Times New Roman" w:eastAsia="Calibri" w:hAnsi="Times New Roman" w:cs="Times New Roman"/>
+          <w:i/>
+          <w:sz w:val="19"/>
+        </w:rPr>
+        <w:t>University of Massachusetts Lowell | Lowell, Massachusetts</w:t>
       </w:r>
     </w:p>
     <w:p>
       <w:pPr>
-        <w:spacing w:after="0"/>
-        <w:rPr>
-          <w:rFonts w:ascii="Times New Roman" w:hAnsi="Times New Roman" w:cs="Times New Roman"/>
-        </w:rPr>
-      </w:pPr>
-      <w:r>
-        <w:rPr>
-          <w:rFonts w:ascii="Times New Roman" w:hAnsi="Times New Roman" w:cs="Times New Roman"/>
-        </w:rPr>
-        <w:t>Resident Advisor</w:t>
+        <w:spacing w:after="11" w:line="256" w:lineRule="auto"/>
+        <w:ind w:left="265" w:hanging="10"/>
+        <w:rPr>
+          <w:rFonts w:ascii="Times New Roman" w:eastAsia="Calibri" w:hAnsi="Times New Roman" w:cs="Times New Roman"/>
+          <w:sz w:val="20"/>
+        </w:rPr>
+      </w:pPr>
+      <w:r>
+        <w:rPr>
+          <w:rFonts w:ascii="Times New Roman" w:eastAsia="Calibri" w:hAnsi="Times New Roman" w:cs="Times New Roman"/>
+          <w:noProof/>
+          <w:sz w:val="22"/>
+        </w:rPr>
+        <mc:AlternateContent>
+          <mc:Choice Requires="wpg">
+            <w:drawing>
+              <wp:anchor distT="0" distB="0" distL="114300" distR="114300" simplePos="0" relativeHeight="251662336" behindDoc="0" locked="0" layoutInCell="1" allowOverlap="1" wp14:anchorId="5E654DA7" wp14:editId="6F60F2AE">
+                <wp:simplePos x="0" y="0"/>
+                <wp:positionH relativeFrom="column">
+                  <wp:posOffset>23664</wp:posOffset>
+                </wp:positionH>
+                <wp:positionV relativeFrom="paragraph">
+                  <wp:posOffset>35287</wp:posOffset>
+                </wp:positionV>
+                <wp:extent cx="38100" cy="371475"/>
+                <wp:effectExtent l="0" t="0" r="0" b="0"/>
+                <wp:wrapSquare wrapText="bothSides"/>
+                <wp:docPr id="1012" name="Group 1012"/>
+                <wp:cNvGraphicFramePr/>
+                <a:graphic xmlns:a="http://schemas.openxmlformats.org/drawingml/2006/main">
+                  <a:graphicData uri="http://schemas.microsoft.com/office/word/2010/wordprocessingGroup">
+                    <wpg:wgp>
+                      <wpg:cNvGrpSpPr/>
+                      <wpg:grpSpPr>
+                        <a:xfrm>
+                          <a:off x="0" y="0"/>
+                          <a:ext cx="38100" cy="371475"/>
+                          <a:chOff x="0" y="0"/>
+                          <a:chExt cx="38100" cy="371475"/>
+                        </a:xfrm>
+                      </wpg:grpSpPr>
+                      <wps:wsp>
+                        <wps:cNvPr id="76" name="Shape 76"/>
+                        <wps:cNvSpPr/>
+                        <wps:spPr>
+                          <a:xfrm>
+                            <a:off x="0" y="0"/>
+                            <a:ext cx="38100" cy="38100"/>
+                          </a:xfrm>
+                          <a:custGeom>
+                            <a:avLst/>
+                            <a:gdLst/>
+                            <a:ahLst/>
+                            <a:cxnLst/>
+                            <a:rect l="0" t="0" r="0" b="0"/>
+                            <a:pathLst>
+                              <a:path w="38100" h="38100">
+                                <a:moveTo>
+                                  <a:pt x="19050" y="0"/>
+                                </a:moveTo>
+                                <a:cubicBezTo>
+                                  <a:pt x="21576" y="0"/>
+                                  <a:pt x="24006" y="483"/>
+                                  <a:pt x="26340" y="1449"/>
+                                </a:cubicBezTo>
+                                <a:cubicBezTo>
+                                  <a:pt x="28674" y="2415"/>
+                                  <a:pt x="30734" y="3793"/>
+                                  <a:pt x="32520" y="5580"/>
+                                </a:cubicBezTo>
+                                <a:cubicBezTo>
+                                  <a:pt x="34307" y="7365"/>
+                                  <a:pt x="35683" y="9425"/>
+                                  <a:pt x="36650" y="11759"/>
+                                </a:cubicBezTo>
+                                <a:cubicBezTo>
+                                  <a:pt x="37617" y="14093"/>
+                                  <a:pt x="38100" y="16523"/>
+                                  <a:pt x="38100" y="19050"/>
+                                </a:cubicBezTo>
+                                <a:cubicBezTo>
+                                  <a:pt x="38100" y="21576"/>
+                                  <a:pt x="37617" y="24006"/>
+                                  <a:pt x="36650" y="26339"/>
+                                </a:cubicBezTo>
+                                <a:cubicBezTo>
+                                  <a:pt x="35683" y="28673"/>
+                                  <a:pt x="34307" y="30734"/>
+                                  <a:pt x="32520" y="32520"/>
+                                </a:cubicBezTo>
+                                <a:cubicBezTo>
+                                  <a:pt x="30734" y="34306"/>
+                                  <a:pt x="28674" y="35683"/>
+                                  <a:pt x="26340" y="36650"/>
+                                </a:cubicBezTo>
+                                <a:cubicBezTo>
+                                  <a:pt x="24006" y="37616"/>
+                                  <a:pt x="21576" y="38099"/>
+                                  <a:pt x="19050" y="38100"/>
+                                </a:cubicBezTo>
+                                <a:cubicBezTo>
+                                  <a:pt x="16524" y="38099"/>
+                                  <a:pt x="14094" y="37616"/>
+                                  <a:pt x="11760" y="36649"/>
+                                </a:cubicBezTo>
+                                <a:cubicBezTo>
+                                  <a:pt x="9426" y="35683"/>
+                                  <a:pt x="7366" y="34306"/>
+                                  <a:pt x="5580" y="32520"/>
+                                </a:cubicBezTo>
+                                <a:cubicBezTo>
+                                  <a:pt x="3793" y="30734"/>
+                                  <a:pt x="2417" y="28673"/>
+                                  <a:pt x="1450" y="26339"/>
+                                </a:cubicBezTo>
+                                <a:cubicBezTo>
+                                  <a:pt x="483" y="24006"/>
+                                  <a:pt x="0" y="21576"/>
+                                  <a:pt x="0" y="19050"/>
+                                </a:cubicBezTo>
+                                <a:cubicBezTo>
+                                  <a:pt x="0" y="16523"/>
+                                  <a:pt x="483" y="14093"/>
+                                  <a:pt x="1450" y="11759"/>
+                                </a:cubicBezTo>
+                                <a:cubicBezTo>
+                                  <a:pt x="2417" y="9425"/>
+                                  <a:pt x="3793" y="7365"/>
+                                  <a:pt x="5580" y="5580"/>
+                                </a:cubicBezTo>
+                                <a:cubicBezTo>
+                                  <a:pt x="7366" y="3793"/>
+                                  <a:pt x="9426" y="2416"/>
+                                  <a:pt x="11760" y="1450"/>
+                                </a:cubicBezTo>
+                                <a:cubicBezTo>
+                                  <a:pt x="14094" y="483"/>
+                                  <a:pt x="16524" y="0"/>
+                                  <a:pt x="19050" y="0"/>
+                                </a:cubicBezTo>
+                                <a:close/>
+                              </a:path>
+                            </a:pathLst>
+                          </a:custGeom>
+                          <a:solidFill>
+                            <a:srgbClr val="172033"/>
+                          </a:solidFill>
+                          <a:ln w="0" cap="flat">
+                            <a:noFill/>
+                            <a:miter lim="127000"/>
+                          </a:ln>
+                          <a:effectLst/>
+                        </wps:spPr>
+                        <wps:bodyPr/>
+                      </wps:wsp>
+                      <wps:wsp>
+                        <wps:cNvPr id="79" name="Shape 79"/>
+                        <wps:cNvSpPr/>
+                        <wps:spPr>
+                          <a:xfrm>
+                            <a:off x="0" y="333375"/>
+                            <a:ext cx="38100" cy="38100"/>
+                          </a:xfrm>
+                          <a:custGeom>
+                            <a:avLst/>
+                            <a:gdLst/>
+                            <a:ahLst/>
+                            <a:cxnLst/>
+                            <a:rect l="0" t="0" r="0" b="0"/>
+                            <a:pathLst>
+                              <a:path w="38100" h="38100">
+                                <a:moveTo>
+                                  <a:pt x="19050" y="0"/>
+                                </a:moveTo>
+                                <a:cubicBezTo>
+                                  <a:pt x="21576" y="0"/>
+                                  <a:pt x="24006" y="483"/>
+                                  <a:pt x="26340" y="1450"/>
+                                </a:cubicBezTo>
+                                <a:cubicBezTo>
+                                  <a:pt x="28674" y="2416"/>
+                                  <a:pt x="30734" y="3792"/>
+                                  <a:pt x="32520" y="5579"/>
+                                </a:cubicBezTo>
+                                <a:cubicBezTo>
+                                  <a:pt x="34307" y="7365"/>
+                                  <a:pt x="35683" y="9424"/>
+                                  <a:pt x="36650" y="11758"/>
+                                </a:cubicBezTo>
+                                <a:cubicBezTo>
+                                  <a:pt x="37617" y="14092"/>
+                                  <a:pt x="38100" y="16523"/>
+                                  <a:pt x="38100" y="19050"/>
+                                </a:cubicBezTo>
+                                <a:cubicBezTo>
+                                  <a:pt x="38100" y="21576"/>
+                                  <a:pt x="37617" y="24006"/>
+                                  <a:pt x="36650" y="26339"/>
+                                </a:cubicBezTo>
+                                <a:cubicBezTo>
+                                  <a:pt x="35683" y="28673"/>
+                                  <a:pt x="34307" y="30733"/>
+                                  <a:pt x="32520" y="32520"/>
+                                </a:cubicBezTo>
+                                <a:cubicBezTo>
+                                  <a:pt x="30734" y="34306"/>
+                                  <a:pt x="28674" y="35682"/>
+                                  <a:pt x="26340" y="36649"/>
+                                </a:cubicBezTo>
+                                <a:cubicBezTo>
+                                  <a:pt x="24006" y="37616"/>
+                                  <a:pt x="21576" y="38099"/>
+                                  <a:pt x="19050" y="38100"/>
+                                </a:cubicBezTo>
+                                <a:cubicBezTo>
+                                  <a:pt x="16524" y="38099"/>
+                                  <a:pt x="14094" y="37616"/>
+                                  <a:pt x="11760" y="36648"/>
+                                </a:cubicBezTo>
+                                <a:cubicBezTo>
+                                  <a:pt x="9426" y="35682"/>
+                                  <a:pt x="7366" y="34306"/>
+                                  <a:pt x="5580" y="32520"/>
+                                </a:cubicBezTo>
+                                <a:cubicBezTo>
+                                  <a:pt x="3793" y="30733"/>
+                                  <a:pt x="2417" y="28673"/>
+                                  <a:pt x="1450" y="26339"/>
+                                </a:cubicBezTo>
+                                <a:cubicBezTo>
+                                  <a:pt x="483" y="24006"/>
+                                  <a:pt x="0" y="21576"/>
+                                  <a:pt x="0" y="19050"/>
+                                </a:cubicBezTo>
+                                <a:cubicBezTo>
+                                  <a:pt x="0" y="16523"/>
+                                  <a:pt x="483" y="14093"/>
+                                  <a:pt x="1450" y="11759"/>
+                                </a:cubicBezTo>
+                                <a:cubicBezTo>
+                                  <a:pt x="2417" y="9424"/>
+                                  <a:pt x="3793" y="7365"/>
+                                  <a:pt x="5580" y="5579"/>
+                                </a:cubicBezTo>
+                                <a:cubicBezTo>
+                                  <a:pt x="7366" y="3792"/>
+                                  <a:pt x="9426" y="2415"/>
+                                  <a:pt x="11760" y="1449"/>
+                                </a:cubicBezTo>
+                                <a:cubicBezTo>
+                                  <a:pt x="14094" y="483"/>
+                                  <a:pt x="16524" y="0"/>
+                                  <a:pt x="19050" y="0"/>
+                                </a:cubicBezTo>
+                                <a:close/>
+                              </a:path>
+                            </a:pathLst>
+                          </a:custGeom>
+                          <a:solidFill>
+                            <a:srgbClr val="172033"/>
+                          </a:solidFill>
+                          <a:ln w="0" cap="flat">
+                            <a:noFill/>
+                            <a:miter lim="127000"/>
+                          </a:ln>
+                          <a:effectLst/>
+                        </wps:spPr>
+                        <wps:bodyPr/>
+                      </wps:wsp>
+                    </wpg:wgp>
+                  </a:graphicData>
+                </a:graphic>
+              </wp:anchor>
+            </w:drawing>
+          </mc:Choice>
+          <mc:Fallback>
+            <w:pict>
+              <v:group w14:anchorId="21052885" id="Group 1012" o:spid="_x0000_s1026" style="position:absolute;margin-left:1.85pt;margin-top:2.8pt;width:3pt;height:29.25pt;z-index:251662336" coordsize="38100,371475" o:gfxdata="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">
+                <v:shape id="Shape 76" o:spid="_x0000_s1027" style="position:absolute;width:38100;height:38100;visibility:visible;mso-wrap-style:square;v-text-anchor:top" coordsize="38100,38100" o:gfxdata="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" path="m19050,v2526,,4956,483,7290,1449c28674,2415,30734,3793,32520,5580v1787,1785,3163,3845,4130,6179c37617,14093,38100,16523,38100,19050v,2526,-483,4956,-1450,7289c35683,28673,34307,30734,32520,32520v-1786,1786,-3846,3163,-6180,4130c24006,37616,21576,38099,19050,38100v-2526,-1,-4956,-484,-7290,-1451c9426,35683,7366,34306,5580,32520,3793,30734,2417,28673,1450,26339,483,24006,,21576,,19050,,16523,483,14093,1450,11759,2417,9425,3793,7365,5580,5580,7366,3793,9426,2416,11760,1450,14094,483,16524,,19050,xe" fillcolor="#172033" stroked="f" strokeweight="0">
+                  <v:stroke miterlimit="83231f" joinstyle="miter"/>
+                  <v:path arrowok="t" textboxrect="0,0,38100,38100"/>
+                </v:shape>
+                <v:shape id="Shape 79" o:spid="_x0000_s1028" style="position:absolute;top:333375;width:38100;height:38100;visibility:visible;mso-wrap-style:square;v-text-anchor:top" coordsize="38100,38100" o:gfxdata="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" path="m19050,v2526,,4956,483,7290,1450c28674,2416,30734,3792,32520,5579v1787,1786,3163,3845,4130,6179c37617,14092,38100,16523,38100,19050v,2526,-483,4956,-1450,7289c35683,28673,34307,30733,32520,32520v-1786,1786,-3846,3162,-6180,4129c24006,37616,21576,38099,19050,38100v-2526,-1,-4956,-484,-7290,-1452c9426,35682,7366,34306,5580,32520,3793,30733,2417,28673,1450,26339,483,24006,,21576,,19050,,16523,483,14093,1450,11759,2417,9424,3793,7365,5580,5579,7366,3792,9426,2415,11760,1449,14094,483,16524,,19050,xe" fillcolor="#172033" stroked="f" strokeweight="0">
+                  <v:stroke miterlimit="83231f" joinstyle="miter"/>
+                  <v:path arrowok="t" textboxrect="0,0,38100,38100"/>
+                </v:shape>
+                <w10:wrap type="square"/>
+              </v:group>
+            </w:pict>
+          </mc:Fallback>
+        </mc:AlternateContent>
+      </w:r>
+      <w:r>
+        <w:rPr>
+          <w:rFonts w:ascii="Times New Roman" w:eastAsia="Calibri" w:hAnsi="Times New Roman" w:cs="Times New Roman"/>
+          <w:sz w:val="20"/>
+        </w:rPr>
+        <w:t>Delivered digital-literacy support to community members, translating laptop and Microsoft application concepts for non-technical users.</w:t>
       </w:r>
     </w:p>
     <w:p>
       <w:pPr>
-        <w:pStyle w:val="ListParagraph"/>
-        <w:numPr>
-          <w:ilvl w:val="0"/>
-          <w:numId w:val="3"/>
-        </w:numPr>
-        <w:spacing w:after="0"/>
-        <w:rPr>
-          <w:rFonts w:ascii="Times New Roman" w:hAnsi="Times New Roman" w:cs="Times New Roman"/>
-        </w:rPr>
-      </w:pPr>
-      <w:r>
-        <w:rPr>
-          <w:rFonts w:ascii="Times New Roman" w:hAnsi="Times New Roman" w:cs="Times New Roman"/>
-        </w:rPr>
-        <w:t>Support and mentor residents while promoting a safe and inclusive residential environment.</w:t>
+        <w:spacing w:after="11" w:line="256" w:lineRule="auto"/>
+        <w:ind w:left="265" w:hanging="10"/>
+        <w:rPr>
+          <w:rFonts w:ascii="Times New Roman" w:eastAsia="Calibri" w:hAnsi="Times New Roman" w:cs="Times New Roman"/>
+          <w:sz w:val="20"/>
+        </w:rPr>
+      </w:pPr>
+      <w:r>
+        <w:rPr>
+          <w:rFonts w:ascii="Times New Roman" w:eastAsia="Calibri" w:hAnsi="Times New Roman" w:cs="Times New Roman"/>
+          <w:sz w:val="20"/>
+        </w:rPr>
+        <w:t>Created training materials from grant-provided modules and collaborated with team members to complete class objectives.</w:t>
       </w:r>
     </w:p>
-    <w:p>
-      <w:pPr>
-        <w:pStyle w:val="ListParagraph"/>
-        <w:numPr>
-          <w:ilvl w:val="0"/>
-          <w:numId w:val="3"/>
-        </w:numPr>
-        <w:spacing w:after="0"/>
-        <w:rPr>
-          <w:rFonts w:ascii="Times New Roman" w:hAnsi="Times New Roman" w:cs="Times New Roman"/>
-        </w:rPr>
-      </w:pPr>
-      <w:r>
-        <w:rPr>
-          <w:rFonts w:ascii="Times New Roman" w:hAnsi="Times New Roman" w:cs="Times New Roman"/>
-        </w:rPr>
-        <w:t>Respond to resident concerns, document incidents, and collaborate with university staff to resolve issues.</w:t>
-      </w:r>
-    </w:p>
-    <w:p>
-      <w:pPr>
-        <w:spacing w:after="0"/>
-        <w:rPr>
-          <w:rFonts w:ascii="Times New Roman" w:hAnsi="Times New Roman" w:cs="Times New Roman"/>
-        </w:rPr>
-      </w:pPr>
-    </w:p>
+    <w:p/>
     <w:sectPr>
       <w:pgSz w:w="12240" w:h="15840"/>
       <w:pgMar w:top="720" w:right="720" w:bottom="720" w:left="720" w:header="720" w:footer="720" w:gutter="0"/>
       <w:cols w:space="720"/>
-      <w:docGrid w:linePitch="360"/>
+      <w:docGrid w:linePitch="272"/>
     </w:sectPr>
   </w:body>
 </w:document>
 </file>
 
 <file path=word/numbering.xml><?xml version="1.0" encoding="utf-8"?>
-<w:numbering xmlns:wpc="http://schemas.microsoft.com/office/word/2010/wordprocessingCanvas" xmlns:cx="http://schemas.microsoft.com/office/drawing/2014/chartex" xmlns:cx1="http://schemas.microsoft.com/office/drawing/2015/9/8/chartex" xmlns:cx2="http://schemas.microsoft.com/office/drawing/2015/10/21/chartex" xmlns:cx3="http://schemas.microsoft.com/office/drawing/2016/5/9/chartex" xmlns:cx4="http://schemas.microsoft.com/office/drawing/2016/5/10/chartex" xmlns:cx5="http://schemas.microsoft.com/office/drawing/2016/5/11/chartex" xmlns:cx6="http://schemas.microsoft.com/office/drawing/2016/5/12/chartex" xmlns:cx7="http://schemas.microsoft.com/office/drawing/2016/5/13/chartex" xmlns:cx8="http://schemas.microsoft.com/office/drawing/2016/5/14/chartex" xmlns:mc="http://schemas.openxmlformats.org/markup-compatibility/2006" xmlns:aink="http://schemas.microsoft.com/office/drawing/2016/ink" xmlns:am3d="http://schemas.microsoft.com/office/drawing/2017/model3d" xmlns:o="urn:schemas-microsoft-com:office:office" xmlns:oel="http://schemas.microsoft.com/office/2019/extlst" xmlns:r="http://schemas.openxmlformats.org/officeDocument/2006/relationships" xmlns:m="http://schemas.openxmlformats.org/officeDocument/2006/math" xmlns:v="urn:schemas-microsoft-com:vml" xmlns:wp14="http://schemas.microsoft.com/office/word/2010/wordprocessingDrawing" xmlns:wp="http://schemas.openxmlformats.org/drawingml/2006/wordprocessingDrawing" xmlns:w10="urn:schemas-microsoft-com:office:word" xmlns:w="http://schemas.openxmlformats.org/wordprocessingml/2006/main" xmlns:w14="http://schemas.microsoft.com/office/word/2010/wordml" xmlns:w15="http://schemas.microsoft.com/office/word/2012/wordml" xmlns:w16cei="http://schemas.microsoft.com/office/word/2026/wordml/cei" xmlns:w16cex="http://schemas.microsoft.com/office/word/2018/wordml/cex" xmlns:w16cid="http://schemas.microsoft.com/office/word/2016/wordml/cid" xmlns:w16="http://schemas.microsoft.com/office/word/2018/wordml" xmlns:w16du="http://schemas.microsoft.com/office/word/2023/wordml/word16du" xmlns:w16sdtdh="http://schemas.microsoft.com/office/word/2020/wordml/sdtdatahash" xmlns:w16sdtfl="http://schemas.microsoft.com/office/word/2024/wordml/sdtformatlock" xmlns:w16se="http://schemas.microsoft.com/office/word/2015/wordml/symex" xmlns:wpg="http://schemas.microsoft.com/office/word/2010/wordprocessingGroup" xmlns:wpi="http://schemas.microsoft.com/office/word/2010/wordprocessingInk" xmlns:wne="http://schemas.microsoft.com/office/word/2006/wordml" xmlns:wps="http://schemas.microsoft.com/office/word/2010/wordprocessingShape" mc:Ignorable="w14 w15 w16se w16cid w16 w16cex w16sdtdh w16sdtfl w16du wp14">
+<w:numbering xmlns:wpc="http://schemas.microsoft.com/office/word/2010/wordprocessingCanvas" xmlns:cx="http://schemas.microsoft.com/office/drawing/2014/chartex" xmlns:cx1="http://schemas.microsoft.com/office/drawing/2015/9/8/chartex" xmlns:cx2="http://schemas.microsoft.com/office/drawing/2015/10/21/chartex" xmlns:cx3="http://schemas.microsoft.com/office/drawing/2016/5/9/chartex" xmlns:cx4="http://schemas.microsoft.com/office/drawing/2016/5/10/chartex" xmlns:cx5="http://schemas.microsoft.com/office/drawing/2016/5/11/chartex" xmlns:cx6="http://schemas.microsoft.com/office/drawing/2016/5/12/chartex" xmlns:cx7="http://schemas.microsoft.com/office/drawing/2016/5/13/chartex" xmlns:cx8="http://schemas.microsoft.com/office/drawing/2016/5/14/chartex" xmlns:mc="http://schemas.openxmlformats.org/markup-compatibility/2006" xmlns:aink="http://schemas.microsoft.com/office/drawing/2016/ink" xmlns:am3d="http://schemas.microsoft.com/office/drawing/2017/model3d" xmlns:o="urn:schemas-microsoft-com:office:office" xmlns:oel="http://schemas.microsoft.com/office/2019/extlst" xmlns:r="http://schemas.openxmlformats.org/officeDocument/2006/relationships" xmlns:m="http://schemas.openxmlformats.org/officeDocument/2006/math" xmlns:v="urn:schemas-microsoft-com:vml" xmlns:wp14="http://schemas.microsoft.com/office/word/2010/wordprocessingDrawing" xmlns:wp="http://schemas.openxmlformats.org/drawingml/2006/wordprocessingDrawing" xmlns:w10="urn:schemas-microsoft-com:office:word" xmlns:w="http://schemas.openxmlformats.org/wordprocessingml/2006/main" xmlns:w14="http://schemas.microsoft.com/office/word/2010/wordml" xmlns:w15="http://schemas.microsoft.com/office/word/2012/wordml" xmlns:w16cex="http://schemas.microsoft.com/office/word/2018/wordml/cex" xmlns:w16cid="http://schemas.microsoft.com/office/word/2016/wordml/cid" xmlns:w16="http://schemas.microsoft.com/office/word/2018/wordml" xmlns:w16du="http://schemas.microsoft.com/office/word/2023/wordml/word16du" xmlns:w16sdtdh="http://schemas.microsoft.com/office/word/2020/wordml/sdtdatahash" xmlns:w16sdtfl="http://schemas.microsoft.com/office/word/2024/wordml/sdtformatlock" xmlns:w16se="http://schemas.microsoft.com/office/word/2015/wordml/symex" xmlns:wpg="http://schemas.microsoft.com/office/word/2010/wordprocessingGroup" xmlns:wpi="http://schemas.microsoft.com/office/word/2010/wordprocessingInk" xmlns:wne="http://schemas.microsoft.com/office/word/2006/wordml" xmlns:wps="http://schemas.microsoft.com/office/word/2010/wordprocessingShape" mc:Ignorable="w14 w15 w16se w16cid w16 w16cex w16sdtdh w16sdtfl w16du wp14">
   <w:abstractNum w:abstractNumId="0" w15:restartNumberingAfterBreak="0">
+    <w:nsid w:val="1CC44EB7"/>
+    <w:multiLevelType w:val="hybridMultilevel"/>
+    <w:tmpl w:val="1D5CA884"/>
+    <w:lvl w:ilvl="0" w:tplc="04090001">
+      <w:start w:val="1"/>
+      <w:numFmt w:val="bullet"/>
+      <w:lvlText w:val=""/>
+      <w:lvlJc w:val="left"/>
+      <w:pPr>
+        <w:ind w:left="360" w:hanging="360"/>
+      </w:pPr>
+      <w:rPr>
+        <w:rFonts w:ascii="Symbol" w:hAnsi="Symbol" w:hint="default"/>
+      </w:rPr>
+    </w:lvl>
+    <w:lvl w:ilvl="1" w:tplc="04090003" w:tentative="1">
+      <w:start w:val="1"/>
+      <w:numFmt w:val="bullet"/>
+      <w:lvlText w:val="o"/>
+      <w:lvlJc w:val="left"/>
+      <w:pPr>
+        <w:ind w:left="1080" w:hanging="360"/>
+      </w:pPr>
+      <w:rPr>
+        <w:rFonts w:ascii="Courier New" w:hAnsi="Courier New" w:cs="Courier New" w:hint="default"/>
+      </w:rPr>
+    </w:lvl>
+    <w:lvl w:ilvl="2" w:tplc="04090005" w:tentative="1">
+      <w:start w:val="1"/>
+      <w:numFmt w:val="bullet"/>
+      <w:lvlText w:val=""/>
+      <w:lvlJc w:val="left"/>
+      <w:pPr>
+        <w:ind w:left="1800" w:hanging="360"/>
+      </w:pPr>
+      <w:rPr>
+        <w:rFonts w:ascii="Wingdings" w:hAnsi="Wingdings" w:hint="default"/>
+      </w:rPr>
+    </w:lvl>
+    <w:lvl w:ilvl="3" w:tplc="04090001" w:tentative="1">
+      <w:start w:val="1"/>
+      <w:numFmt w:val="bullet"/>
+      <w:lvlText w:val=""/>
+      <w:lvlJc w:val="left"/>
+      <w:pPr>
+        <w:ind w:left="2520" w:hanging="360"/>
+      </w:pPr>
+      <w:rPr>
+        <w:rFonts w:ascii="Symbol" w:hAnsi="Symbol" w:hint="default"/>
+      </w:rPr>
+    </w:lvl>
+    <w:lvl w:ilvl="4" w:tplc="04090003" w:tentative="1">
+      <w:start w:val="1"/>
+      <w:numFmt w:val="bullet"/>
+      <w:lvlText w:val="o"/>
+      <w:lvlJc w:val="left"/>
+      <w:pPr>
+        <w:ind w:left="3240" w:hanging="360"/>
+      </w:pPr>
+      <w:rPr>
+        <w:rFonts w:ascii="Courier New" w:hAnsi="Courier New" w:cs="Courier New" w:hint="default"/>
+      </w:rPr>
+    </w:lvl>
+    <w:lvl w:ilvl="5" w:tplc="04090005" w:tentative="1">
+      <w:start w:val="1"/>
+      <w:numFmt w:val="bullet"/>
+      <w:lvlText w:val=""/>
+      <w:lvlJc w:val="left"/>
+      <w:pPr>
+        <w:ind w:left="3960" w:hanging="360"/>
+      </w:pPr>
+      <w:rPr>
+        <w:rFonts w:ascii="Wingdings" w:hAnsi="Wingdings" w:hint="default"/>
+      </w:rPr>
+    </w:lvl>
+    <w:lvl w:ilvl="6" w:tplc="04090001" w:tentative="1">
+      <w:start w:val="1"/>
+      <w:numFmt w:val="bullet"/>
+      <w:lvlText w:val=""/>
+      <w:lvlJc w:val="left"/>
+      <w:pPr>
+        <w:ind w:left="4680" w:hanging="360"/>
+      </w:pPr>
+      <w:rPr>
+        <w:rFonts w:ascii="Symbol" w:hAnsi="Symbol" w:hint="default"/>
+      </w:rPr>
+    </w:lvl>
+    <w:lvl w:ilvl="7" w:tplc="04090003" w:tentative="1">
+      <w:start w:val="1"/>
+      <w:numFmt w:val="bullet"/>
+      <w:lvlText w:val="o"/>
+      <w:lvlJc w:val="left"/>
+      <w:pPr>
+        <w:ind w:left="5400" w:hanging="360"/>
+      </w:pPr>
+      <w:rPr>
+        <w:rFonts w:ascii="Courier New" w:hAnsi="Courier New" w:cs="Courier New" w:hint="default"/>
+      </w:rPr>
+    </w:lvl>
+    <w:lvl w:ilvl="8" w:tplc="04090005" w:tentative="1">
+      <w:start w:val="1"/>
+      <w:numFmt w:val="bullet"/>
+      <w:lvlText w:val=""/>
+      <w:lvlJc w:val="left"/>
+      <w:pPr>
+        <w:ind w:left="6120" w:hanging="360"/>
+      </w:pPr>
+      <w:rPr>
+        <w:rFonts w:ascii="Wingdings" w:hAnsi="Wingdings" w:hint="default"/>
+      </w:rPr>
+    </w:lvl>
+  </w:abstractNum>
+  <w:abstractNum w:abstractNumId="1" w15:restartNumberingAfterBreak="0">
     <w:nsid w:val="41157C73"/>
     <w:multiLevelType w:val="hybridMultilevel"/>
     <w:tmpl w:val="6BD0AA84"/>
@@ -1342,7 +2421,7 @@
       </w:rPr>
     </w:lvl>
   </w:abstractNum>
-  <w:abstractNum w:abstractNumId="1" w15:restartNumberingAfterBreak="0">
+  <w:abstractNum w:abstractNumId="2" w15:restartNumberingAfterBreak="0">
     <w:nsid w:val="4A52016F"/>
     <w:multiLevelType w:val="hybridMultilevel"/>
     <w:tmpl w:val="5574A526"/>
@@ -1455,7 +2534,7 @@
       </w:rPr>
     </w:lvl>
   </w:abstractNum>
-  <w:abstractNum w:abstractNumId="2" w15:restartNumberingAfterBreak="0">
+  <w:abstractNum w:abstractNumId="3" w15:restartNumberingAfterBreak="0">
     <w:nsid w:val="50A511AB"/>
     <w:multiLevelType w:val="hybridMultilevel"/>
     <w:tmpl w:val="EAB0F314"/>
@@ -1568,7 +2647,7 @@
       </w:rPr>
     </w:lvl>
   </w:abstractNum>
-  <w:abstractNum w:abstractNumId="3" w15:restartNumberingAfterBreak="0">
+  <w:abstractNum w:abstractNumId="4" w15:restartNumberingAfterBreak="0">
     <w:nsid w:val="54201657"/>
     <w:multiLevelType w:val="hybridMultilevel"/>
     <w:tmpl w:val="80CA6C94"/>
@@ -1682,16 +2761,19 @@
     </w:lvl>
   </w:abstractNum>
   <w:num w:numId="1" w16cid:durableId="1478495494">
+    <w:abstractNumId w:val="4"/>
+  </w:num>
+  <w:num w:numId="2" w16cid:durableId="1971130887">
+    <w:abstractNumId w:val="2"/>
+  </w:num>
+  <w:num w:numId="3" w16cid:durableId="2098596035">
+    <w:abstractNumId w:val="1"/>
+  </w:num>
+  <w:num w:numId="4" w16cid:durableId="1183057655">
     <w:abstractNumId w:val="3"/>
   </w:num>
-  <w:num w:numId="2" w16cid:durableId="1971130887">
-    <w:abstractNumId w:val="1"/>
-  </w:num>
-  <w:num w:numId="3" w16cid:durableId="2098596035">
+  <w:num w:numId="5" w16cid:durableId="307898801">
     <w:abstractNumId w:val="0"/>
-  </w:num>
-  <w:num w:numId="4" w16cid:durableId="1183057655">
-    <w:abstractNumId w:val="2"/>
   </w:num>
 </w:numbering>
 </file>
@@ -2299,6 +3381,7 @@
   <w:style w:type="character" w:default="1" w:styleId="DefaultParagraphFont">
     <w:name w:val="Default Paragraph Font"/>
     <w:uiPriority w:val="1"/>
+    <w:semiHidden/>
     <w:unhideWhenUsed/>
   </w:style>
   <w:style w:type="table" w:default="1" w:styleId="TableNormal">
@@ -2969,23 +4052,6 @@
 </file>
 
 <file path=customXml/item1.xml><?xml version="1.0" encoding="utf-8"?>
-<p:properties xmlns:p="http://schemas.microsoft.com/office/2006/metadata/properties" xmlns:xsi="http://www.w3.org/2001/XMLSchema-instance" xmlns:pc="http://schemas.microsoft.com/office/infopath/2007/PartnerControls">
-  <documentManagement>
-    <_activity xmlns="a0c27cee-a95d-4809-9de9-df5ad27b9f59" xsi:nil="true"/>
-  </documentManagement>
-</p:properties>
-</file>
-
-<file path=customXml/item2.xml><?xml version="1.0" encoding="utf-8"?>
-<?mso-contentType ?>
-<FormTemplates xmlns="http://schemas.microsoft.com/sharepoint/v3/contenttype/forms">
-  <Display>DocumentLibraryForm</Display>
-  <Edit>DocumentLibraryForm</Edit>
-  <New>DocumentLibraryForm</New>
-</FormTemplates>
-</file>
-
-<file path=customXml/item3.xml><?xml version="1.0" encoding="utf-8"?>
 <ct:contentTypeSchema xmlns:ct="http://schemas.microsoft.com/office/2006/metadata/contentType" xmlns:ma="http://schemas.microsoft.com/office/2006/metadata/properties/metaAttributes" ct:_="" ma:_="" ma:contentTypeName="Document" ma:contentTypeID="0x01010078A3B08B9F151A4688D1BE3945C70144" ma:contentTypeVersion="14" ma:contentTypeDescription="Create a new document." ma:contentTypeScope="" ma:versionID="a06dc9687c53bf3c232e4afd7f55256a">
   <xsd:schema xmlns:xsd="http://www.w3.org/2001/XMLSchema" xmlns:xs="http://www.w3.org/2001/XMLSchema" xmlns:p="http://schemas.microsoft.com/office/2006/metadata/properties" xmlns:ns3="a0c27cee-a95d-4809-9de9-df5ad27b9f59" xmlns:ns4="43920f67-3d01-4307-8d49-c9ea81cb7f94" targetNamespace="http://schemas.microsoft.com/office/2006/metadata/properties" ma:root="true" ma:fieldsID="f3dff5d9f6c091ab19a9ab2db75c0a5e" ns3:_="" ns4:_="">
     <xsd:import namespace="a0c27cee-a95d-4809-9de9-df5ad27b9f59"/>
@@ -3212,25 +4278,24 @@
 </ct:contentTypeSchema>
 </file>
 
-<file path=customXml/itemProps1.xml><?xml version="1.0" encoding="utf-8"?>
-<ds:datastoreItem xmlns:ds="http://schemas.openxmlformats.org/officeDocument/2006/customXml" ds:itemID="{F45BEC3E-0732-450F-818B-28C759921943}">
-  <ds:schemaRefs>
-    <ds:schemaRef ds:uri="http://schemas.microsoft.com/office/2006/metadata/properties"/>
-    <ds:schemaRef ds:uri="http://schemas.microsoft.com/office/infopath/2007/PartnerControls"/>
-    <ds:schemaRef ds:uri="a0c27cee-a95d-4809-9de9-df5ad27b9f59"/>
-  </ds:schemaRefs>
-</ds:datastoreItem>
+<file path=customXml/item2.xml><?xml version="1.0" encoding="utf-8"?>
+<?mso-contentType ?>
+<FormTemplates xmlns="http://schemas.microsoft.com/sharepoint/v3/contenttype/forms">
+  <Display>DocumentLibraryForm</Display>
+  <Edit>DocumentLibraryForm</Edit>
+  <New>DocumentLibraryForm</New>
+</FormTemplates>
 </file>
 
-<file path=customXml/itemProps2.xml><?xml version="1.0" encoding="utf-8"?>
-<ds:datastoreItem xmlns:ds="http://schemas.openxmlformats.org/officeDocument/2006/customXml" ds:itemID="{355358F7-3BBB-4A2C-955E-0B30F135C6B6}">
-  <ds:schemaRefs>
-    <ds:schemaRef ds:uri="http://schemas.microsoft.com/sharepoint/v3/contenttype/forms"/>
-  </ds:schemaRefs>
-</ds:datastoreItem>
+<file path=customXml/item3.xml><?xml version="1.0" encoding="utf-8"?>
+<p:properties xmlns:p="http://schemas.microsoft.com/office/2006/metadata/properties" xmlns:xsi="http://www.w3.org/2001/XMLSchema-instance" xmlns:pc="http://schemas.microsoft.com/office/infopath/2007/PartnerControls">
+  <documentManagement>
+    <_activity xmlns="a0c27cee-a95d-4809-9de9-df5ad27b9f59" xsi:nil="true"/>
+  </documentManagement>
+</p:properties>
 </file>
 
-<file path=customXml/itemProps3.xml><?xml version="1.0" encoding="utf-8"?>
+<file path=customXml/itemProps1.xml><?xml version="1.0" encoding="utf-8"?>
 <ds:datastoreItem xmlns:ds="http://schemas.openxmlformats.org/officeDocument/2006/customXml" ds:itemID="{9D789D5A-353B-4F06-AA27-5846102A4C94}">
   <ds:schemaRefs>
     <ds:schemaRef ds:uri="http://schemas.microsoft.com/office/2006/metadata/contentType"/>
@@ -3247,4 +4312,22 @@
     <ds:schemaRef ds:uri="http://schemas.microsoft.com/internal/obd"/>
   </ds:schemaRefs>
 </ds:datastoreItem>
+</file>
+
+<file path=customXml/itemProps2.xml><?xml version="1.0" encoding="utf-8"?>
+<ds:datastoreItem xmlns:ds="http://schemas.openxmlformats.org/officeDocument/2006/customXml" ds:itemID="{355358F7-3BBB-4A2C-955E-0B30F135C6B6}">
+  <ds:schemaRefs>
+    <ds:schemaRef ds:uri="http://schemas.microsoft.com/sharepoint/v3/contenttype/forms"/>
+  </ds:schemaRefs>
+</ds:datastoreItem>
+</file>
+
+<file path=customXml/itemProps3.xml><?xml version="1.0" encoding="utf-8"?>
+<ds:datastoreItem xmlns:ds="http://schemas.openxmlformats.org/officeDocument/2006/customXml" ds:itemID="{F45BEC3E-0732-450F-818B-28C759921943}">
+  <ds:schemaRefs>
+    <ds:schemaRef ds:uri="http://schemas.microsoft.com/office/2006/metadata/properties"/>
+    <ds:schemaRef ds:uri="http://schemas.microsoft.com/office/infopath/2007/PartnerControls"/>
+    <ds:schemaRef ds:uri="a0c27cee-a95d-4809-9de9-df5ad27b9f59"/>
+  </ds:schemaRefs>
+</ds:datastoreItem>
 </file>
</xml_diff>